<commit_message>
refactor: eliminacion de la base de datos intermedia que ya no utilizamos
</commit_message>
<xml_diff>
--- a/informe/informe_TP_Mundial_2026.docx
+++ b/informe/informe_TP_Mundial_2026.docx
@@ -205,12 +205,6 @@
         <w:gridCol w:w="3426"/>
       </w:tblGrid>
       <w:tr>
-        <w:tblPrEx>
-          <w:tblCellMar>
-            <w:top w:w="0" w:type="dxa"/>
-            <w:bottom w:w="0" w:type="dxa"/>
-          </w:tblCellMar>
-        </w:tblPrEx>
         <w:tc>
           <w:tcPr>
             <w:tcW w:w="3600" w:type="dxa"/>
@@ -233,7 +227,6 @@
             <w:pPr>
               <w:jc w:val="center"/>
             </w:pPr>
-            <w:proofErr w:type="spellStart"/>
             <w:r>
               <w:rPr>
                 <w:b/>
@@ -244,7 +237,6 @@
               </w:rPr>
               <w:t>Integrante</w:t>
             </w:r>
-            <w:proofErr w:type="spellEnd"/>
           </w:p>
         </w:tc>
         <w:tc>
@@ -269,7 +261,6 @@
             <w:pPr>
               <w:jc w:val="center"/>
             </w:pPr>
-            <w:proofErr w:type="gramStart"/>
             <w:r>
               <w:rPr>
                 <w:b/>
@@ -278,18 +269,7 @@
                 <w:sz w:val="20"/>
                 <w:szCs w:val="20"/>
               </w:rPr>
-              <w:t>N.º</w:t>
-            </w:r>
-            <w:proofErr w:type="gramEnd"/>
-            <w:r>
-              <w:rPr>
-                <w:b/>
-                <w:bCs/>
-                <w:color w:val="FFFFFF"/>
-                <w:sz w:val="20"/>
-                <w:szCs w:val="20"/>
-              </w:rPr>
-              <w:t xml:space="preserve"> de Registro</w:t>
+              <w:t>N.º de Registro</w:t>
             </w:r>
           </w:p>
         </w:tc>
@@ -315,7 +295,6 @@
             <w:pPr>
               <w:jc w:val="center"/>
             </w:pPr>
-            <w:proofErr w:type="spellStart"/>
             <w:r>
               <w:rPr>
                 <w:b/>
@@ -324,29 +303,12 @@
                 <w:sz w:val="20"/>
                 <w:szCs w:val="20"/>
               </w:rPr>
-              <w:t>Usuario</w:t>
-            </w:r>
-            <w:proofErr w:type="spellEnd"/>
-            <w:r>
-              <w:rPr>
-                <w:b/>
-                <w:bCs/>
-                <w:color w:val="FFFFFF"/>
-                <w:sz w:val="20"/>
-                <w:szCs w:val="20"/>
-              </w:rPr>
-              <w:t xml:space="preserve"> GitHub</w:t>
+              <w:t>Usuario GitHub</w:t>
             </w:r>
           </w:p>
         </w:tc>
       </w:tr>
       <w:tr>
-        <w:tblPrEx>
-          <w:tblCellMar>
-            <w:top w:w="0" w:type="dxa"/>
-            <w:bottom w:w="0" w:type="dxa"/>
-          </w:tblCellMar>
-        </w:tblPrEx>
         <w:tc>
           <w:tcPr>
             <w:tcW w:w="3600" w:type="dxa"/>
@@ -422,7 +384,6 @@
             </w:tcMar>
           </w:tcPr>
           <w:p>
-            <w:proofErr w:type="spellStart"/>
             <w:r>
               <w:rPr>
                 <w:sz w:val="20"/>
@@ -430,17 +391,10 @@
               </w:rPr>
               <w:t>cargaribotti</w:t>
             </w:r>
-            <w:proofErr w:type="spellEnd"/>
           </w:p>
         </w:tc>
       </w:tr>
       <w:tr>
-        <w:tblPrEx>
-          <w:tblCellMar>
-            <w:top w:w="0" w:type="dxa"/>
-            <w:bottom w:w="0" w:type="dxa"/>
-          </w:tblCellMar>
-        </w:tblPrEx>
         <w:tc>
           <w:tcPr>
             <w:tcW w:w="3600" w:type="dxa"/>
@@ -516,7 +470,6 @@
             </w:tcMar>
           </w:tcPr>
           <w:p>
-            <w:proofErr w:type="spellStart"/>
             <w:r>
               <w:rPr>
                 <w:sz w:val="20"/>
@@ -524,17 +477,10 @@
               </w:rPr>
               <w:t>FMorichetti</w:t>
             </w:r>
-            <w:proofErr w:type="spellEnd"/>
           </w:p>
         </w:tc>
       </w:tr>
       <w:tr>
-        <w:tblPrEx>
-          <w:tblCellMar>
-            <w:top w:w="0" w:type="dxa"/>
-            <w:bottom w:w="0" w:type="dxa"/>
-          </w:tblCellMar>
-        </w:tblPrEx>
         <w:tc>
           <w:tcPr>
             <w:tcW w:w="3600" w:type="dxa"/>
@@ -689,21 +635,7 @@
         <w:rPr>
           <w:lang w:val="es-AR"/>
         </w:rPr>
-        <w:t xml:space="preserve">El presente trabajo analiza la relación entre indicadores económicos y demográficos de los 48 países participantes de la Copa del Mundo FIFA 2026 y el rendimiento de sus selecciones nacionales, medido mediante el puntaje FIFA </w:t>
-      </w:r>
-      <w:proofErr w:type="spellStart"/>
-      <w:r>
-        <w:rPr>
-          <w:lang w:val="es-AR"/>
-        </w:rPr>
-        <w:t>pre-torneo</w:t>
-      </w:r>
-      <w:proofErr w:type="spellEnd"/>
-      <w:r>
-        <w:rPr>
-          <w:lang w:val="es-AR"/>
-        </w:rPr>
-        <w:t xml:space="preserve">. </w:t>
+        <w:t xml:space="preserve">El presente trabajo analiza la relación entre indicadores económicos y demográficos de los 48 países participantes de la Copa del Mundo FIFA 2026 y el rendimiento de sus selecciones nacionales, medido mediante el puntaje FIFA pre-torneo. </w:t>
       </w:r>
     </w:p>
     <w:p>
@@ -761,7 +693,6 @@
         </w:rPr>
         <w:t xml:space="preserve">, </w:t>
       </w:r>
-      <w:proofErr w:type="spellStart"/>
       <w:r>
         <w:rPr>
           <w:i/>
@@ -770,14 +701,12 @@
         </w:rPr>
         <w:t>numpy</w:t>
       </w:r>
-      <w:proofErr w:type="spellEnd"/>
       <w:r>
         <w:rPr>
           <w:lang w:val="es-AR"/>
         </w:rPr>
         <w:t xml:space="preserve">, </w:t>
       </w:r>
-      <w:proofErr w:type="spellStart"/>
       <w:r>
         <w:rPr>
           <w:i/>
@@ -786,14 +715,12 @@
         </w:rPr>
         <w:t>matplotlib</w:t>
       </w:r>
-      <w:proofErr w:type="spellEnd"/>
       <w:r>
         <w:rPr>
           <w:lang w:val="es-AR"/>
         </w:rPr>
         <w:t xml:space="preserve">, </w:t>
       </w:r>
-      <w:proofErr w:type="spellStart"/>
       <w:r>
         <w:rPr>
           <w:i/>
@@ -802,14 +729,12 @@
         </w:rPr>
         <w:t>seaborn</w:t>
       </w:r>
-      <w:proofErr w:type="spellEnd"/>
       <w:r>
         <w:rPr>
           <w:lang w:val="es-AR"/>
         </w:rPr>
         <w:t xml:space="preserve">, </w:t>
       </w:r>
-      <w:proofErr w:type="spellStart"/>
       <w:r>
         <w:rPr>
           <w:i/>
@@ -818,14 +743,12 @@
         </w:rPr>
         <w:t>scipy</w:t>
       </w:r>
-      <w:proofErr w:type="spellEnd"/>
       <w:r>
         <w:rPr>
           <w:lang w:val="es-AR"/>
         </w:rPr>
         <w:t xml:space="preserve"> y </w:t>
       </w:r>
-      <w:proofErr w:type="spellStart"/>
       <w:r>
         <w:rPr>
           <w:i/>
@@ -834,7 +757,6 @@
         </w:rPr>
         <w:t>sympy</w:t>
       </w:r>
-      <w:proofErr w:type="spellEnd"/>
       <w:r>
         <w:rPr>
           <w:lang w:val="es-AR"/>
@@ -911,6 +833,7 @@
         </w:rPr>
         <w:t xml:space="preserve">El fútbol suele presentarse como </w:t>
       </w:r>
+      <w:commentRangeStart w:id="0"/>
       <w:r>
         <w:rPr>
           <w:i/>
@@ -923,7 +846,23 @@
         <w:rPr>
           <w:lang w:val="es-AR"/>
         </w:rPr>
-        <w:t>: once jugadores, una pelota y la posibilidad teórica de que cualquier nación compita con las grandes potencias. Sin embargo, detrás de esa narrativa existen dinámicas estructurales que merecen ser cuantificadas. Selecciones de países con PBI modesto han logrado competir históricamente al máximo nivel junto a potencias económicas globales, lo que convierte al fútbol en un laboratorio social y económico particularmente atractivo para el análisis cuantitativo.</w:t>
+        <w:t xml:space="preserve">: </w:t>
+      </w:r>
+      <w:commentRangeEnd w:id="0"/>
+      <w:r>
+        <w:rPr>
+          <w:rStyle w:val="CommentReference"/>
+          <w:sz w:val="22"/>
+          <w:szCs w:val="22"/>
+          <w:lang w:val="es-AR"/>
+        </w:rPr>
+        <w:commentReference w:id="0"/>
+      </w:r>
+      <w:r>
+        <w:rPr>
+          <w:lang w:val="es-AR"/>
+        </w:rPr>
+        <w:t>once jugadores, una pelota y la posibilidad teórica de que cualquier nación compita con las grandes potencias. Sin embargo, detrás de esa narrativa existen dinámicas estructurales que merecen ser cuantificadas. Selecciones de países con PBI modesto han logrado competir históricamente al máximo nivel junto a potencias económicas globales, lo que convierte al fútbol en un laboratorio social y económico particularmente atractivo para el análisis cuantitativo.</w:t>
       </w:r>
     </w:p>
     <w:p>
@@ -948,29 +887,7 @@
           <w:iCs/>
           <w:lang w:val="es-AR"/>
         </w:rPr>
-        <w:t xml:space="preserve">¿Existe en el puntaje FIFA y el valor de mercado del plantel </w:t>
-      </w:r>
-      <w:proofErr w:type="spellStart"/>
-      <w:r>
-        <w:rPr>
-          <w:b/>
-          <w:bCs/>
-          <w:i/>
-          <w:iCs/>
-          <w:lang w:val="es-AR"/>
-        </w:rPr>
-        <w:t>pre-torneo</w:t>
-      </w:r>
-      <w:proofErr w:type="spellEnd"/>
-      <w:r>
-        <w:rPr>
-          <w:b/>
-          <w:bCs/>
-          <w:i/>
-          <w:iCs/>
-          <w:lang w:val="es-AR"/>
-        </w:rPr>
-        <w:t xml:space="preserve"> de los equipos participantes del Mundial 2026 alguna relación con los indicadores económicos (PBI, PBI per cápita) y demográficos (población, continente, idioma, religión, densidad) de sus países de origen?</w:t>
+        <w:t>¿Existe en el puntaje FIFA y el valor de mercado del plantel pre-torneo de los equipos participantes del Mundial 2026 alguna relación con los indicadores económicos (PBI, PBI per cápita) y demográficos (población, continente, idioma, religión, densidad) de sus países de origen?</w:t>
       </w:r>
     </w:p>
     <w:p>
@@ -1043,21 +960,7 @@
         <w:rPr>
           <w:lang w:val="es-AR"/>
         </w:rPr>
-        <w:t xml:space="preserve">Se integraron tres conjuntos de datos mediante operaciones de </w:t>
-      </w:r>
-      <w:proofErr w:type="spellStart"/>
-      <w:r>
-        <w:rPr>
-          <w:lang w:val="es-AR"/>
-        </w:rPr>
-        <w:t>merge</w:t>
-      </w:r>
-      <w:proofErr w:type="spellEnd"/>
-      <w:r>
-        <w:rPr>
-          <w:lang w:val="es-AR"/>
-        </w:rPr>
-        <w:t xml:space="preserve"> sobre claves ISO-3166 y códigos FIFA:</w:t>
+        <w:t>Se integraron tres conjuntos de datos mediante operaciones de merge sobre claves ISO-3166 y códigos FIFA:</w:t>
       </w:r>
     </w:p>
     <w:p>
@@ -1091,12 +994,6 @@
         <w:gridCol w:w="3826"/>
       </w:tblGrid>
       <w:tr>
-        <w:tblPrEx>
-          <w:tblCellMar>
-            <w:top w:w="0" w:type="dxa"/>
-            <w:bottom w:w="0" w:type="dxa"/>
-          </w:tblCellMar>
-        </w:tblPrEx>
         <w:tc>
           <w:tcPr>
             <w:tcW w:w="2200" w:type="dxa"/>
@@ -1195,30 +1092,12 @@
                 <w:sz w:val="20"/>
                 <w:szCs w:val="20"/>
               </w:rPr>
-              <w:t xml:space="preserve">Variables </w:t>
+              <w:t>Variables principales</w:t>
             </w:r>
-            <w:proofErr w:type="spellStart"/>
-            <w:r>
-              <w:rPr>
-                <w:b/>
-                <w:bCs/>
-                <w:color w:val="FFFFFF"/>
-                <w:sz w:val="20"/>
-                <w:szCs w:val="20"/>
-              </w:rPr>
-              <w:t>principales</w:t>
-            </w:r>
-            <w:proofErr w:type="spellEnd"/>
           </w:p>
         </w:tc>
       </w:tr>
       <w:tr>
-        <w:tblPrEx>
-          <w:tblCellMar>
-            <w:top w:w="0" w:type="dxa"/>
-            <w:bottom w:w="0" w:type="dxa"/>
-          </w:tblCellMar>
-        </w:tblPrEx>
         <w:tc>
           <w:tcPr>
             <w:tcW w:w="2200" w:type="dxa"/>
@@ -1273,31 +1152,23 @@
               </w:rPr>
               <w:t xml:space="preserve">Kaggle / </w:t>
             </w:r>
-            <w:proofErr w:type="spellStart"/>
+            <w:commentRangeStart w:id="1"/>
             <w:r>
               <w:rPr>
                 <w:sz w:val="20"/>
                 <w:szCs w:val="20"/>
               </w:rPr>
-              <w:t>datos</w:t>
+              <w:t>datos propios</w:t>
             </w:r>
-            <w:proofErr w:type="spellEnd"/>
+            <w:commentRangeEnd w:id="1"/>
             <w:r>
               <w:rPr>
-                <w:sz w:val="20"/>
-                <w:szCs w:val="20"/>
-              </w:rPr>
-              <w:t xml:space="preserve"> </w:t>
+                <w:rStyle w:val="CommentReference"/>
+                <w:sz w:val="22"/>
+                <w:szCs w:val="22"/>
+              </w:rPr>
+              <w:commentReference w:id="1"/>
             </w:r>
-            <w:proofErr w:type="spellStart"/>
-            <w:r>
-              <w:rPr>
-                <w:sz w:val="20"/>
-                <w:szCs w:val="20"/>
-              </w:rPr>
-              <w:t>propios</w:t>
-            </w:r>
-            <w:proofErr w:type="spellEnd"/>
           </w:p>
         </w:tc>
         <w:tc>
@@ -1335,12 +1206,6 @@
         </w:tc>
       </w:tr>
       <w:tr>
-        <w:tblPrEx>
-          <w:tblCellMar>
-            <w:top w:w="0" w:type="dxa"/>
-            <w:bottom w:w="0" w:type="dxa"/>
-          </w:tblCellMar>
-        </w:tblPrEx>
         <w:tc>
           <w:tcPr>
             <w:tcW w:w="2200" w:type="dxa"/>
@@ -1388,21 +1253,12 @@
             </w:tcMar>
           </w:tcPr>
           <w:p>
-            <w:proofErr w:type="spellStart"/>
             <w:r>
               <w:rPr>
                 <w:sz w:val="20"/>
                 <w:szCs w:val="20"/>
               </w:rPr>
-              <w:t>SimpleMaps</w:t>
-            </w:r>
-            <w:proofErr w:type="spellEnd"/>
-            <w:r>
-              <w:rPr>
-                <w:sz w:val="20"/>
-                <w:szCs w:val="20"/>
-              </w:rPr>
-              <w:t xml:space="preserve"> (simplemaps.com)</w:t>
+              <w:t>SimpleMaps (simplemaps.com)</w:t>
             </w:r>
           </w:p>
         </w:tc>
@@ -1441,12 +1297,6 @@
         </w:tc>
       </w:tr>
       <w:tr>
-        <w:tblPrEx>
-          <w:tblCellMar>
-            <w:top w:w="0" w:type="dxa"/>
-            <w:bottom w:w="0" w:type="dxa"/>
-          </w:tblCellMar>
-        </w:tblPrEx>
         <w:tc>
           <w:tcPr>
             <w:tcW w:w="2200" w:type="dxa"/>
@@ -1499,17 +1349,8 @@
                 <w:sz w:val="20"/>
                 <w:szCs w:val="20"/>
               </w:rPr>
-              <w:t xml:space="preserve">FIFA </w:t>
+              <w:t>FIFA oficial</w:t>
             </w:r>
-            <w:proofErr w:type="spellStart"/>
-            <w:r>
-              <w:rPr>
-                <w:sz w:val="20"/>
-                <w:szCs w:val="20"/>
-              </w:rPr>
-              <w:t>oficial</w:t>
-            </w:r>
-            <w:proofErr w:type="spellEnd"/>
           </w:p>
         </w:tc>
         <w:tc>
@@ -1569,29 +1410,43 @@
           <w:bCs/>
           <w:lang w:val="es-AR"/>
         </w:rPr>
-        <w:t xml:space="preserve">Variable dependiente: </w:t>
-      </w:r>
-      <w:r>
-        <w:rPr>
-          <w:lang w:val="es-AR"/>
-        </w:rPr>
-        <w:t xml:space="preserve">puntaje FIFA </w:t>
-      </w:r>
-      <w:proofErr w:type="spellStart"/>
-      <w:r>
-        <w:rPr>
-          <w:lang w:val="es-AR"/>
-        </w:rPr>
-        <w:t>pre-torneo</w:t>
-      </w:r>
-      <w:proofErr w:type="spellEnd"/>
-      <w:r>
-        <w:rPr>
-          <w:lang w:val="es-AR"/>
-        </w:rPr>
-        <w:t xml:space="preserve"> (</w:t>
-      </w:r>
-      <w:proofErr w:type="spellStart"/>
+        <w:t xml:space="preserve">Variable </w:t>
+      </w:r>
+      <w:commentRangeStart w:id="2"/>
+      <w:r>
+        <w:rPr>
+          <w:b/>
+          <w:bCs/>
+          <w:lang w:val="es-AR"/>
+        </w:rPr>
+        <w:t>dependiente</w:t>
+      </w:r>
+      <w:commentRangeEnd w:id="2"/>
+      <w:r>
+        <w:rPr>
+          <w:rStyle w:val="CommentReference"/>
+          <w:b/>
+          <w:bCs/>
+          <w:sz w:val="22"/>
+          <w:szCs w:val="22"/>
+          <w:lang w:val="es-AR"/>
+        </w:rPr>
+        <w:commentReference w:id="2"/>
+      </w:r>
+      <w:r>
+        <w:rPr>
+          <w:b/>
+          <w:bCs/>
+          <w:lang w:val="es-AR"/>
+        </w:rPr>
+        <w:t xml:space="preserve">: </w:t>
+      </w:r>
+      <w:r>
+        <w:rPr>
+          <w:lang w:val="es-AR"/>
+        </w:rPr>
+        <w:t>puntaje FIFA pre-torneo (</w:t>
+      </w:r>
       <w:r>
         <w:rPr>
           <w:i/>
@@ -1600,7 +1455,6 @@
         </w:rPr>
         <w:t>puntos_FIFA</w:t>
       </w:r>
-      <w:proofErr w:type="spellEnd"/>
       <w:r>
         <w:rPr>
           <w:lang w:val="es-AR"/>
@@ -1630,7 +1484,6 @@
         </w:rPr>
         <w:t>valor de mercado del plantel en euros (</w:t>
       </w:r>
-      <w:proofErr w:type="spellStart"/>
       <w:r>
         <w:rPr>
           <w:i/>
@@ -1639,7 +1492,6 @@
         </w:rPr>
         <w:t>valor_en_euros</w:t>
       </w:r>
-      <w:proofErr w:type="spellEnd"/>
       <w:r>
         <w:rPr>
           <w:lang w:val="es-AR"/>
@@ -1714,35 +1566,7 @@
         <w:rPr>
           <w:lang w:val="es-AR"/>
         </w:rPr>
-        <w:t>Corrección de codificación: el nombre ‘</w:t>
-      </w:r>
-      <w:proofErr w:type="spellStart"/>
-      <w:r>
-        <w:rPr>
-          <w:lang w:val="es-AR"/>
-        </w:rPr>
-        <w:t>Curaço</w:t>
-      </w:r>
-      <w:proofErr w:type="spellEnd"/>
-      <w:r>
-        <w:rPr>
-          <w:lang w:val="es-AR"/>
-        </w:rPr>
-        <w:t>’ presentaba un carácter mal codificado y fue corregido a ‘</w:t>
-      </w:r>
-      <w:proofErr w:type="spellStart"/>
-      <w:r>
-        <w:rPr>
-          <w:lang w:val="es-AR"/>
-        </w:rPr>
-        <w:t>Curaçao</w:t>
-      </w:r>
-      <w:proofErr w:type="spellEnd"/>
-      <w:r>
-        <w:rPr>
-          <w:lang w:val="es-AR"/>
-        </w:rPr>
-        <w:t>’.</w:t>
+        <w:t>Corrección de codificación: el nombre ‘Curaço’ presentaba un carácter mal codificado y fue corregido a ‘Curaçao’.</w:t>
       </w:r>
     </w:p>
     <w:p>
@@ -1760,147 +1584,7 @@
         <w:rPr>
           <w:lang w:val="es-AR"/>
         </w:rPr>
-        <w:t>Normalización de nombres de países mediante diccionario de mapeo (ej. ‘</w:t>
-      </w:r>
-      <w:proofErr w:type="spellStart"/>
-      <w:r>
-        <w:rPr>
-          <w:lang w:val="es-AR"/>
-        </w:rPr>
-        <w:t>Iran</w:t>
-      </w:r>
-      <w:proofErr w:type="spellEnd"/>
-      <w:r>
-        <w:rPr>
-          <w:lang w:val="es-AR"/>
-        </w:rPr>
-        <w:t xml:space="preserve"> (</w:t>
-      </w:r>
-      <w:proofErr w:type="spellStart"/>
-      <w:r>
-        <w:rPr>
-          <w:lang w:val="es-AR"/>
-        </w:rPr>
-        <w:t>Islamic</w:t>
-      </w:r>
-      <w:proofErr w:type="spellEnd"/>
-      <w:r>
-        <w:rPr>
-          <w:lang w:val="es-AR"/>
-        </w:rPr>
-        <w:t xml:space="preserve"> </w:t>
-      </w:r>
-      <w:proofErr w:type="spellStart"/>
-      <w:r>
-        <w:rPr>
-          <w:lang w:val="es-AR"/>
-        </w:rPr>
-        <w:t>Republic</w:t>
-      </w:r>
-      <w:proofErr w:type="spellEnd"/>
-      <w:r>
-        <w:rPr>
-          <w:lang w:val="es-AR"/>
-        </w:rPr>
-        <w:t xml:space="preserve"> </w:t>
-      </w:r>
-      <w:proofErr w:type="spellStart"/>
-      <w:r>
-        <w:rPr>
-          <w:lang w:val="es-AR"/>
-        </w:rPr>
-        <w:t>of</w:t>
-      </w:r>
-      <w:proofErr w:type="spellEnd"/>
-      <w:r>
-        <w:rPr>
-          <w:lang w:val="es-AR"/>
-        </w:rPr>
-        <w:t>)’ → ‘</w:t>
-      </w:r>
-      <w:proofErr w:type="spellStart"/>
-      <w:r>
-        <w:rPr>
-          <w:lang w:val="es-AR"/>
-        </w:rPr>
-        <w:t>Iran</w:t>
-      </w:r>
-      <w:proofErr w:type="spellEnd"/>
-      <w:r>
-        <w:rPr>
-          <w:lang w:val="es-AR"/>
-        </w:rPr>
-        <w:t>’, ‘</w:t>
-      </w:r>
-      <w:proofErr w:type="spellStart"/>
-      <w:r>
-        <w:rPr>
-          <w:lang w:val="es-AR"/>
-        </w:rPr>
-        <w:t>Türkiye</w:t>
-      </w:r>
-      <w:proofErr w:type="spellEnd"/>
-      <w:r>
-        <w:rPr>
-          <w:lang w:val="es-AR"/>
-        </w:rPr>
-        <w:t>’ → ‘</w:t>
-      </w:r>
-      <w:proofErr w:type="spellStart"/>
-      <w:r>
-        <w:rPr>
-          <w:lang w:val="es-AR"/>
-        </w:rPr>
-        <w:t>Turkey</w:t>
-      </w:r>
-      <w:proofErr w:type="spellEnd"/>
-      <w:r>
-        <w:rPr>
-          <w:lang w:val="es-AR"/>
-        </w:rPr>
-        <w:t>’, ‘</w:t>
-      </w:r>
-      <w:proofErr w:type="spellStart"/>
-      <w:r>
-        <w:rPr>
-          <w:lang w:val="es-AR"/>
-        </w:rPr>
-        <w:t>Côte</w:t>
-      </w:r>
-      <w:proofErr w:type="spellEnd"/>
-      <w:r>
-        <w:rPr>
-          <w:lang w:val="es-AR"/>
-        </w:rPr>
-        <w:t xml:space="preserve"> </w:t>
-      </w:r>
-      <w:proofErr w:type="spellStart"/>
-      <w:r>
-        <w:rPr>
-          <w:lang w:val="es-AR"/>
-        </w:rPr>
-        <w:t>d’Ivoire</w:t>
-      </w:r>
-      <w:proofErr w:type="spellEnd"/>
-      <w:r>
-        <w:rPr>
-          <w:lang w:val="es-AR"/>
-        </w:rPr>
-        <w:t xml:space="preserve">’ → ‘Ivory Coast’) para permitir el </w:t>
-      </w:r>
-      <w:proofErr w:type="spellStart"/>
-      <w:r>
-        <w:rPr>
-          <w:lang w:val="es-AR"/>
-        </w:rPr>
-        <w:t>merge</w:t>
-      </w:r>
-      <w:proofErr w:type="spellEnd"/>
-      <w:r>
-        <w:rPr>
-          <w:lang w:val="es-AR"/>
-        </w:rPr>
-        <w:t xml:space="preserve"> con la tabla de información demográfica.</w:t>
+        <w:t>Normalización de nombres de países mediante diccionario de mapeo (ej. ‘Iran (Islamic Republic of)’ → ‘Iran’, ‘Türkiye’ → ‘Turkey’, ‘Côte d’Ivoire’ → ‘Ivory Coast’) para permitir el merge con la tabla de información demográfica.</w:t>
       </w:r>
     </w:p>
     <w:p>
@@ -1945,72 +1629,29 @@
         <w:rPr>
           <w:lang w:val="es-AR"/>
         </w:rPr>
-        <w:t xml:space="preserve">Imputación del PBI de </w:t>
-      </w:r>
-      <w:proofErr w:type="spellStart"/>
-      <w:r>
-        <w:rPr>
-          <w:lang w:val="es-AR"/>
-        </w:rPr>
-        <w:t>Curaçao</w:t>
-      </w:r>
-      <w:proofErr w:type="spellEnd"/>
-      <w:r>
-        <w:rPr>
-          <w:lang w:val="es-AR"/>
-        </w:rPr>
-        <w:t xml:space="preserve"> (dato ausente): se asignó el valor de 3.561 millones de USD correspondiente a la estimación del Banco Mundial (2022). </w:t>
-      </w:r>
-      <w:r>
-        <w:t xml:space="preserve">Este </w:t>
-      </w:r>
-      <w:proofErr w:type="spellStart"/>
-      <w:r>
-        <w:t>dato</w:t>
-      </w:r>
-      <w:proofErr w:type="spellEnd"/>
-      <w:r>
+        <w:t>Imputación del PBI de Curaçao (dato ausente): se asignó el valor de 3.561 millones de USD correspondiente a la estimación del Banco Mundial (2022).</w:t>
+      </w:r>
+      <w:commentRangeStart w:id="3"/>
+      <w:r>
+        <w:rPr>
+          <w:lang w:val="es-AR"/>
+        </w:rPr>
         <w:t xml:space="preserve"> </w:t>
       </w:r>
-      <w:proofErr w:type="spellStart"/>
-      <w:r>
-        <w:t>único</w:t>
-      </w:r>
-      <w:proofErr w:type="spellEnd"/>
-      <w:r>
-        <w:t xml:space="preserve"> no </w:t>
-      </w:r>
-      <w:proofErr w:type="spellStart"/>
-      <w:r>
-        <w:t>afecta</w:t>
-      </w:r>
-      <w:proofErr w:type="spellEnd"/>
-      <w:r>
-        <w:t xml:space="preserve"> </w:t>
-      </w:r>
-      <w:proofErr w:type="spellStart"/>
-      <w:r>
-        <w:t>materialmente</w:t>
-      </w:r>
-      <w:proofErr w:type="spellEnd"/>
-      <w:r>
-        <w:t xml:space="preserve"> </w:t>
-      </w:r>
-      <w:proofErr w:type="spellStart"/>
-      <w:r>
-        <w:t>los</w:t>
-      </w:r>
-      <w:proofErr w:type="spellEnd"/>
-      <w:r>
-        <w:t xml:space="preserve"> </w:t>
-      </w:r>
-      <w:proofErr w:type="spellStart"/>
-      <w:r>
-        <w:t>resultados</w:t>
-      </w:r>
-      <w:proofErr w:type="spellEnd"/>
-      <w:r>
-        <w:t>.</w:t>
+      <w:r>
+        <w:rPr>
+          <w:highlight w:val="yellow"/>
+        </w:rPr>
+        <w:t>Este dato único no afecta materialmente los resultados.</w:t>
+      </w:r>
+      <w:commentRangeEnd w:id="3"/>
+      <w:r>
+        <w:rPr>
+          <w:rStyle w:val="CommentReference"/>
+          <w:sz w:val="22"/>
+          <w:szCs w:val="22"/>
+        </w:rPr>
+        <w:commentReference w:id="3"/>
       </w:r>
     </w:p>
     <w:p>
@@ -2028,35 +1669,7 @@
         <w:rPr>
           <w:lang w:val="es-AR"/>
         </w:rPr>
-        <w:t>Creación de la variable derivada PBI per cápita (</w:t>
-      </w:r>
-      <w:proofErr w:type="spellStart"/>
-      <w:r>
-        <w:rPr>
-          <w:lang w:val="es-AR"/>
-        </w:rPr>
-        <w:t>pbi</w:t>
-      </w:r>
-      <w:proofErr w:type="spellEnd"/>
-      <w:r>
-        <w:rPr>
-          <w:lang w:val="es-AR"/>
-        </w:rPr>
-        <w:t xml:space="preserve"> / </w:t>
-      </w:r>
-      <w:proofErr w:type="spellStart"/>
-      <w:r>
-        <w:rPr>
-          <w:lang w:val="es-AR"/>
-        </w:rPr>
-        <w:t>poblacion</w:t>
-      </w:r>
-      <w:proofErr w:type="spellEnd"/>
-      <w:r>
-        <w:rPr>
-          <w:lang w:val="es-AR"/>
-        </w:rPr>
-        <w:t>) como indicador de desarrollo relativo.</w:t>
+        <w:t>Creación de la variable derivada PBI per cápita (pbi / poblacion) como indicador de desarrollo relativo.</w:t>
       </w:r>
     </w:p>
     <w:p>
@@ -2077,23 +1690,10 @@
       </w:pPr>
       <w:r>
         <w:rPr>
-          <w:lang w:val="es-AR"/>
-        </w:rPr>
-        <w:t xml:space="preserve">El </w:t>
-      </w:r>
-      <w:proofErr w:type="spellStart"/>
-      <w:r>
-        <w:rPr>
-          <w:lang w:val="es-AR"/>
-        </w:rPr>
-        <w:t>dataset</w:t>
-      </w:r>
-      <w:proofErr w:type="spellEnd"/>
-      <w:r>
-        <w:rPr>
-          <w:lang w:val="es-AR"/>
-        </w:rPr>
-        <w:t xml:space="preserve"> integrado final contiene 48 observaciones (una por selección) y 17 variables de análisis.</w:t>
+          <w:highlight w:val="yellow"/>
+          <w:lang w:val="es-AR"/>
+        </w:rPr>
+        <w:t>El dataset integrado final contiene 48 observaciones (una por selección) y 17 variables de análisis.</w:t>
       </w:r>
     </w:p>
     <w:p>
@@ -2134,6 +1734,177 @@
         <w:spacing w:after="140"/>
         <w:jc w:val="both"/>
         <w:rPr>
+          <w:highlight w:val="yellow"/>
+          <w:lang w:val="es-AR"/>
+        </w:rPr>
+      </w:pPr>
+      <w:r>
+        <w:rPr>
+          <w:highlight w:val="yellow"/>
+          <w:lang w:val="es-AR"/>
+        </w:rPr>
+        <w:t>| Herramienta | Uso |</w:t>
+      </w:r>
+    </w:p>
+    <w:p>
+      <w:pPr>
+        <w:spacing w:after="140"/>
+        <w:jc w:val="both"/>
+        <w:rPr>
+          <w:highlight w:val="yellow"/>
+          <w:lang w:val="es-AR"/>
+        </w:rPr>
+      </w:pPr>
+      <w:r>
+        <w:rPr>
+          <w:highlight w:val="yellow"/>
+          <w:lang w:val="es-AR"/>
+        </w:rPr>
+        <w:t>|---|---|</w:t>
+      </w:r>
+    </w:p>
+    <w:p>
+      <w:pPr>
+        <w:spacing w:after="140"/>
+        <w:jc w:val="both"/>
+        <w:rPr>
+          <w:highlight w:val="yellow"/>
+          <w:lang w:val="es-AR"/>
+        </w:rPr>
+      </w:pPr>
+      <w:r>
+        <w:rPr>
+          <w:highlight w:val="yellow"/>
+          <w:lang w:val="es-AR"/>
+        </w:rPr>
+        <w:t>| `pandas` | Carga, limpieza, merges y transformaciones |</w:t>
+      </w:r>
+    </w:p>
+    <w:p>
+      <w:pPr>
+        <w:spacing w:after="140"/>
+        <w:jc w:val="both"/>
+        <w:rPr>
+          <w:highlight w:val="yellow"/>
+          <w:lang w:val="es-AR"/>
+        </w:rPr>
+      </w:pPr>
+      <w:r>
+        <w:rPr>
+          <w:highlight w:val="yellow"/>
+          <w:lang w:val="es-AR"/>
+        </w:rPr>
+        <w:t>| `numpy` | Operaciones numéricas y normalización de escala |</w:t>
+      </w:r>
+    </w:p>
+    <w:p>
+      <w:pPr>
+        <w:spacing w:after="140"/>
+        <w:jc w:val="both"/>
+        <w:rPr>
+          <w:highlight w:val="yellow"/>
+          <w:lang w:val="es-AR"/>
+        </w:rPr>
+      </w:pPr>
+      <w:r>
+        <w:rPr>
+          <w:highlight w:val="yellow"/>
+          <w:lang w:val="es-AR"/>
+        </w:rPr>
+        <w:t>| `matplotlib` / `seaborn` | Visualización: heatmaps, boxplots, scatterplots |</w:t>
+      </w:r>
+    </w:p>
+    <w:p>
+      <w:pPr>
+        <w:spacing w:after="140"/>
+        <w:jc w:val="both"/>
+        <w:rPr>
+          <w:highlight w:val="yellow"/>
+          <w:lang w:val="es-AR"/>
+        </w:rPr>
+      </w:pPr>
+      <w:r>
+        <w:rPr>
+          <w:highlight w:val="yellow"/>
+          <w:lang w:val="es-AR"/>
+        </w:rPr>
+        <w:t>| `scipy.optimize.curve_fit` | Ajuste de modelos funcionales (lineal, log, potencia, cuadrático) |</w:t>
+      </w:r>
+    </w:p>
+    <w:p>
+      <w:pPr>
+        <w:spacing w:after="140"/>
+        <w:jc w:val="both"/>
+        <w:rPr>
+          <w:highlight w:val="yellow"/>
+          <w:lang w:val="es-AR"/>
+        </w:rPr>
+      </w:pPr>
+      <w:r>
+        <w:rPr>
+          <w:highlight w:val="yellow"/>
+          <w:lang w:val="es-AR"/>
+        </w:rPr>
+        <w:t>| `scipy.stats.pearsonr` | Correlación de Pearson con p-valor |</w:t>
+      </w:r>
+    </w:p>
+    <w:p>
+      <w:pPr>
+        <w:spacing w:after="140"/>
+        <w:jc w:val="both"/>
+        <w:rPr>
+          <w:highlight w:val="yellow"/>
+          <w:lang w:val="es-AR"/>
+        </w:rPr>
+      </w:pPr>
+      <w:r>
+        <w:rPr>
+          <w:highlight w:val="yellow"/>
+          <w:lang w:val="es-AR"/>
+        </w:rPr>
+        <w:t>| `sympy` | Derivadas analíticas del modelo cuadrático |</w:t>
+      </w:r>
+    </w:p>
+    <w:p>
+      <w:pPr>
+        <w:spacing w:after="140"/>
+        <w:jc w:val="both"/>
+        <w:rPr>
+          <w:highlight w:val="yellow"/>
+          <w:lang w:val="es-AR"/>
+        </w:rPr>
+      </w:pPr>
+    </w:p>
+    <w:p>
+      <w:pPr>
+        <w:spacing w:after="140"/>
+        <w:jc w:val="both"/>
+        <w:rPr>
+          <w:lang w:val="es-AR"/>
+        </w:rPr>
+      </w:pPr>
+      <w:r>
+        <w:rPr>
+          <w:highlight w:val="yellow"/>
+          <w:lang w:val="es-AR"/>
+        </w:rPr>
+        <w:t>El análisis se desarrolló íntegramente en **Jupyter Notebook** con Python 3.12.</w:t>
+      </w:r>
+    </w:p>
+    <w:p>
+      <w:pPr>
+        <w:spacing w:after="140"/>
+        <w:jc w:val="both"/>
+        <w:rPr>
+          <w:lang w:val="es-AR"/>
+        </w:rPr>
+      </w:pPr>
+    </w:p>
+    <w:p>
+      <w:pPr>
+        <w:spacing w:after="140"/>
+        <w:jc w:val="both"/>
+        <w:rPr>
           <w:lang w:val="es-AR"/>
         </w:rPr>
       </w:pPr>
@@ -2167,70 +1938,42 @@
         </w:rPr>
         <w:t xml:space="preserve">. Se aplicaron: (a) análisis exploratorio con estadísticos descriptivos y detección de valores nulos; (b) resumen estadístico agrupado con </w:t>
       </w:r>
-      <w:proofErr w:type="spellStart"/>
       <w:r>
         <w:rPr>
           <w:i/>
           <w:iCs/>
           <w:lang w:val="es-AR"/>
         </w:rPr>
-        <w:t>groupby</w:t>
-      </w:r>
-      <w:proofErr w:type="spellEnd"/>
+        <w:t>groupby()</w:t>
+      </w:r>
+      <w:r>
+        <w:rPr>
+          <w:lang w:val="es-AR"/>
+        </w:rPr>
+        <w:t xml:space="preserve"> por continente, religión e idioma; (c) visualización mediante mapas de calor de correlación, diagramas de dispersión, boxplots y gráficos de torta; (d) ajuste de cuatro modelos funcionales (lineal, logarítmico, potencia y cuadrático) con </w:t>
+      </w:r>
       <w:r>
         <w:rPr>
           <w:i/>
           <w:iCs/>
           <w:lang w:val="es-AR"/>
         </w:rPr>
-        <w:t>()</w:t>
-      </w:r>
-      <w:r>
-        <w:rPr>
-          <w:lang w:val="es-AR"/>
-        </w:rPr>
-        <w:t xml:space="preserve"> por continente, religión e idioma; (c) visualización mediante mapas de calor de correlación, diagramas de dispersión, </w:t>
-      </w:r>
-      <w:proofErr w:type="spellStart"/>
-      <w:r>
-        <w:rPr>
-          <w:lang w:val="es-AR"/>
-        </w:rPr>
-        <w:t>boxplots</w:t>
-      </w:r>
-      <w:proofErr w:type="spellEnd"/>
-      <w:r>
-        <w:rPr>
-          <w:lang w:val="es-AR"/>
-        </w:rPr>
-        <w:t xml:space="preserve"> y gráficos de torta; (d) ajuste de cuatro modelos funcionales (lineal, logarítmico, potencia y cuadrático) con </w:t>
-      </w:r>
-      <w:proofErr w:type="spellStart"/>
+        <w:t>scipy.optimize.curve_fit</w:t>
+      </w:r>
+      <w:r>
+        <w:rPr>
+          <w:lang w:val="es-AR"/>
+        </w:rPr>
+        <w:t xml:space="preserve">, seleccionando el mejor por R²; y (e) cálculo simbólico de derivadas con </w:t>
+      </w:r>
       <w:r>
         <w:rPr>
           <w:i/>
           <w:iCs/>
           <w:lang w:val="es-AR"/>
         </w:rPr>
-        <w:t>scipy.optimize.curve_fit</w:t>
-      </w:r>
-      <w:proofErr w:type="spellEnd"/>
-      <w:r>
-        <w:rPr>
-          <w:lang w:val="es-AR"/>
-        </w:rPr>
-        <w:t xml:space="preserve">, seleccionando el mejor por R²; y (e) cálculo simbólico de derivadas con </w:t>
-      </w:r>
-      <w:proofErr w:type="spellStart"/>
-      <w:r>
-        <w:rPr>
-          <w:i/>
-          <w:iCs/>
-          <w:lang w:val="es-AR"/>
-        </w:rPr>
         <w:t>sympy</w:t>
       </w:r>
-      <w:proofErr w:type="spellEnd"/>
       <w:r>
         <w:rPr>
           <w:lang w:val="es-AR"/>
@@ -2289,21 +2032,7 @@
         <w:rPr>
           <w:lang w:val="es-AR"/>
         </w:rPr>
-        <w:t xml:space="preserve">El análisis de correlación de Pearson entre el valor de mercado del plantel (en euros) y el puntaje FIFA </w:t>
-      </w:r>
-      <w:proofErr w:type="spellStart"/>
-      <w:r>
-        <w:rPr>
-          <w:lang w:val="es-AR"/>
-        </w:rPr>
-        <w:t>pre-torneo</w:t>
-      </w:r>
-      <w:proofErr w:type="spellEnd"/>
-      <w:r>
-        <w:rPr>
-          <w:lang w:val="es-AR"/>
-        </w:rPr>
-        <w:t xml:space="preserve"> arroja </w:t>
+        <w:t xml:space="preserve">El análisis de correlación de Pearson entre el valor de mercado del plantel (en euros) y el puntaje FIFA pre-torneo arroja </w:t>
       </w:r>
       <w:r>
         <w:rPr>
@@ -2466,6 +2195,7 @@
           <w:noProof/>
           <w:lang w:val="es-AR"/>
         </w:rPr>
+        <w:lastRenderedPageBreak/>
         <w:drawing>
           <wp:inline distT="0" distB="0" distL="0" distR="0" wp14:anchorId="30E57974" wp14:editId="099494F3">
             <wp:extent cx="5731510" cy="2010410"/>
@@ -2482,7 +2212,7 @@
                     <pic:cNvPicPr/>
                   </pic:nvPicPr>
                   <pic:blipFill>
-                    <a:blip r:embed="rId7" cstate="print">
+                    <a:blip r:embed="rId12" cstate="print">
                       <a:extLst>
                         <a:ext uri="{28A0092B-C50C-407E-A947-70E740481C1C}">
                           <a14:useLocalDpi xmlns:a14="http://schemas.microsoft.com/office/drawing/2010/main" val="0"/>
@@ -2576,7 +2306,6 @@
         </w:rPr>
         <w:t xml:space="preserve">La derivada analítica del modelo cuadrático, obtenida con </w:t>
       </w:r>
-      <w:proofErr w:type="spellStart"/>
       <w:r>
         <w:rPr>
           <w:i/>
@@ -2585,7 +2314,6 @@
         </w:rPr>
         <w:t>sympy</w:t>
       </w:r>
-      <w:proofErr w:type="spellEnd"/>
       <w:r>
         <w:rPr>
           <w:lang w:val="es-AR"/>
@@ -2604,28 +2332,7 @@
         <w:rPr>
           <w:lang w:val="es-AR"/>
         </w:rPr>
-        <w:t xml:space="preserve">: los equipos con planteles de menor valor obtienen más puntos por cada €100M </w:t>
-      </w:r>
-      <w:r>
-        <w:rPr>
-          <w:lang w:val="es-AR"/>
-        </w:rPr>
-        <w:lastRenderedPageBreak/>
-        <w:t>adicionales que los equipos con planteles ya costosos. El vértice de la parábola —ubicado en x = −b</w:t>
-      </w:r>
-      <w:proofErr w:type="gramStart"/>
-      <w:r>
-        <w:rPr>
-          <w:lang w:val="es-AR"/>
-        </w:rPr>
-        <w:t>/(</w:t>
-      </w:r>
-      <w:proofErr w:type="gramEnd"/>
-      <w:r>
-        <w:rPr>
-          <w:lang w:val="es-AR"/>
-        </w:rPr>
-        <w:t>2a) ≈ €1,30B— representa el nivel de inversión donde f’(x) = 0: el punto de máximo rendimiento según el modelo.</w:t>
+        <w:t>: los equipos con planteles de menor valor obtienen más puntos por cada €100M adicionales que los equipos con planteles ya costosos. El vértice de la parábola —ubicado en x = −b/(2a) ≈ €1,30B— representa el nivel de inversión donde f’(x) = 0: el punto de máximo rendimiento según el modelo.</w:t>
       </w:r>
     </w:p>
     <w:p>
@@ -2695,7 +2402,7 @@
                     <pic:cNvPicPr/>
                   </pic:nvPicPr>
                   <pic:blipFill>
-                    <a:blip r:embed="rId8" cstate="print">
+                    <a:blip r:embed="rId13" cstate="print">
                       <a:extLst>
                         <a:ext uri="{28A0092B-C50C-407E-A947-70E740481C1C}">
                           <a14:useLocalDpi xmlns:a14="http://schemas.microsoft.com/office/drawing/2010/main" val="0"/>
@@ -2767,6 +2474,7 @@
         <w:rPr>
           <w:lang w:val="es-AR"/>
         </w:rPr>
+        <w:lastRenderedPageBreak/>
         <w:t>4.3. El caso excepcional de Argentina</w:t>
       </w:r>
     </w:p>
@@ -2812,7 +2520,6 @@
         </w:rPr>
         <w:t xml:space="preserve">, que se ubica cuarto con 1.825,97 puntos. Su residuo positivo de +161 puntos respecto al modelo cuadrático es el mayor del </w:t>
       </w:r>
-      <w:proofErr w:type="spellStart"/>
       <w:r>
         <w:rPr>
           <w:lang w:val="es-AR"/>
@@ -2823,14 +2530,7 @@
         <w:rPr>
           <w:lang w:val="es-AR"/>
         </w:rPr>
-        <w:t>ataset</w:t>
-      </w:r>
-      <w:proofErr w:type="spellEnd"/>
-      <w:r>
-        <w:rPr>
-          <w:lang w:val="es-AR"/>
-        </w:rPr>
-        <w:t>, lo que indica que la selección rinde sistemáticamente por encima de lo que su inversión predice.</w:t>
+        <w:t>ataset, lo que indica que la selección rinde sistemáticamente por encima de lo que su inversión predice.</w:t>
       </w:r>
     </w:p>
     <w:p>
@@ -2907,21 +2607,7 @@
         <w:rPr>
           <w:lang w:val="es-AR"/>
         </w:rPr>
-        <w:t xml:space="preserve">El análisis por continente mediante </w:t>
-      </w:r>
-      <w:proofErr w:type="spellStart"/>
-      <w:r>
-        <w:rPr>
-          <w:lang w:val="es-AR"/>
-        </w:rPr>
-        <w:t>boxplots</w:t>
-      </w:r>
-      <w:proofErr w:type="spellEnd"/>
-      <w:r>
-        <w:rPr>
-          <w:lang w:val="es-AR"/>
-        </w:rPr>
-        <w:t xml:space="preserve"> y estadísticos agrupados revela diferencias sistemáticas en la distribución de puntajes FIFA:</w:t>
+        <w:t>El análisis por continente mediante boxplots y estadísticos agrupados revela diferencias sistemáticas en la distribución de puntajes FIFA:</w:t>
       </w:r>
     </w:p>
     <w:p>
@@ -2957,12 +2643,6 @@
         <w:gridCol w:w="2126"/>
       </w:tblGrid>
       <w:tr>
-        <w:tblPrEx>
-          <w:tblCellMar>
-            <w:top w:w="0" w:type="dxa"/>
-            <w:bottom w:w="0" w:type="dxa"/>
-          </w:tblCellMar>
-        </w:tblPrEx>
         <w:tc>
           <w:tcPr>
             <w:tcW w:w="2600" w:type="dxa"/>
@@ -2985,7 +2665,6 @@
             <w:pPr>
               <w:jc w:val="center"/>
             </w:pPr>
-            <w:proofErr w:type="spellStart"/>
             <w:r>
               <w:rPr>
                 <w:b/>
@@ -2996,7 +2675,6 @@
               </w:rPr>
               <w:t>Confederación</w:t>
             </w:r>
-            <w:proofErr w:type="spellEnd"/>
           </w:p>
         </w:tc>
         <w:tc>
@@ -3021,7 +2699,6 @@
             <w:pPr>
               <w:jc w:val="center"/>
             </w:pPr>
-            <w:proofErr w:type="spellStart"/>
             <w:r>
               <w:rPr>
                 <w:b/>
@@ -3032,7 +2709,6 @@
               </w:rPr>
               <w:t>Equipos</w:t>
             </w:r>
-            <w:proofErr w:type="spellEnd"/>
           </w:p>
         </w:tc>
         <w:tc>
@@ -3125,7 +2801,6 @@
             <w:pPr>
               <w:jc w:val="center"/>
             </w:pPr>
-            <w:proofErr w:type="spellStart"/>
             <w:r>
               <w:rPr>
                 <w:b/>
@@ -3136,17 +2811,10 @@
               </w:rPr>
               <w:t>Observación</w:t>
             </w:r>
-            <w:proofErr w:type="spellEnd"/>
           </w:p>
         </w:tc>
       </w:tr>
       <w:tr>
-        <w:tblPrEx>
-          <w:tblCellMar>
-            <w:top w:w="0" w:type="dxa"/>
-            <w:bottom w:w="0" w:type="dxa"/>
-          </w:tblCellMar>
-        </w:tblPrEx>
         <w:tc>
           <w:tcPr>
             <w:tcW w:w="2600" w:type="dxa"/>
@@ -3165,21 +2833,12 @@
             </w:tcMar>
           </w:tcPr>
           <w:p>
-            <w:proofErr w:type="spellStart"/>
             <w:r>
               <w:rPr>
                 <w:sz w:val="20"/>
                 <w:szCs w:val="20"/>
               </w:rPr>
-              <w:t>Sudamérica</w:t>
-            </w:r>
-            <w:proofErr w:type="spellEnd"/>
-            <w:r>
-              <w:rPr>
-                <w:sz w:val="20"/>
-                <w:szCs w:val="20"/>
-              </w:rPr>
-              <w:t xml:space="preserve"> (CONMEBOL)</w:t>
+              <w:t>Sudamérica (CONMEBOL)</w:t>
             </w:r>
           </w:p>
         </w:tc>
@@ -3291,41 +2950,17 @@
             </w:tcMar>
           </w:tcPr>
           <w:p>
-            <w:proofErr w:type="spellStart"/>
             <w:r>
               <w:rPr>
                 <w:sz w:val="20"/>
                 <w:szCs w:val="20"/>
               </w:rPr>
-              <w:t>Distribución</w:t>
+              <w:t>Distribución compacta y alta</w:t>
             </w:r>
-            <w:proofErr w:type="spellEnd"/>
-            <w:r>
-              <w:rPr>
-                <w:sz w:val="20"/>
-                <w:szCs w:val="20"/>
-              </w:rPr>
-              <w:t xml:space="preserve"> compacta y </w:t>
-            </w:r>
-            <w:proofErr w:type="spellStart"/>
-            <w:r>
-              <w:rPr>
-                <w:sz w:val="20"/>
-                <w:szCs w:val="20"/>
-              </w:rPr>
-              <w:t>alta</w:t>
-            </w:r>
-            <w:proofErr w:type="spellEnd"/>
           </w:p>
         </w:tc>
       </w:tr>
       <w:tr>
-        <w:tblPrEx>
-          <w:tblCellMar>
-            <w:top w:w="0" w:type="dxa"/>
-            <w:bottom w:w="0" w:type="dxa"/>
-          </w:tblCellMar>
-        </w:tblPrEx>
         <w:tc>
           <w:tcPr>
             <w:tcW w:w="2600" w:type="dxa"/>
@@ -3466,43 +3101,12 @@
                 <w:sz w:val="20"/>
                 <w:szCs w:val="20"/>
               </w:rPr>
-              <w:t xml:space="preserve">Alta </w:t>
+              <w:t>Alta dispersión intra-grupo</w:t>
             </w:r>
-            <w:proofErr w:type="spellStart"/>
-            <w:r>
-              <w:rPr>
-                <w:sz w:val="20"/>
-                <w:szCs w:val="20"/>
-              </w:rPr>
-              <w:t>dispersión</w:t>
-            </w:r>
-            <w:proofErr w:type="spellEnd"/>
-            <w:r>
-              <w:rPr>
-                <w:sz w:val="20"/>
-                <w:szCs w:val="20"/>
-              </w:rPr>
-              <w:t xml:space="preserve"> intra-</w:t>
-            </w:r>
-            <w:proofErr w:type="spellStart"/>
-            <w:r>
-              <w:rPr>
-                <w:sz w:val="20"/>
-                <w:szCs w:val="20"/>
-              </w:rPr>
-              <w:t>grupo</w:t>
-            </w:r>
-            <w:proofErr w:type="spellEnd"/>
           </w:p>
         </w:tc>
       </w:tr>
       <w:tr>
-        <w:tblPrEx>
-          <w:tblCellMar>
-            <w:top w:w="0" w:type="dxa"/>
-            <w:bottom w:w="0" w:type="dxa"/>
-          </w:tblCellMar>
-        </w:tblPrEx>
         <w:tc>
           <w:tcPr>
             <w:tcW w:w="2600" w:type="dxa"/>
@@ -3649,12 +3253,6 @@
         </w:tc>
       </w:tr>
       <w:tr>
-        <w:tblPrEx>
-          <w:tblCellMar>
-            <w:top w:w="0" w:type="dxa"/>
-            <w:bottom w:w="0" w:type="dxa"/>
-          </w:tblCellMar>
-        </w:tblPrEx>
         <w:tc>
           <w:tcPr>
             <w:tcW w:w="2600" w:type="dxa"/>
@@ -3801,12 +3399,6 @@
         </w:tc>
       </w:tr>
       <w:tr>
-        <w:tblPrEx>
-          <w:tblCellMar>
-            <w:top w:w="0" w:type="dxa"/>
-            <w:bottom w:w="0" w:type="dxa"/>
-          </w:tblCellMar>
-        </w:tblPrEx>
         <w:tc>
           <w:tcPr>
             <w:tcW w:w="2600" w:type="dxa"/>
@@ -3942,41 +3534,17 @@
             </w:tcMar>
           </w:tcPr>
           <w:p>
-            <w:proofErr w:type="spellStart"/>
             <w:r>
               <w:rPr>
                 <w:sz w:val="20"/>
                 <w:szCs w:val="20"/>
               </w:rPr>
-              <w:t>Distribución</w:t>
+              <w:t>Distribución asimétrica</w:t>
             </w:r>
-            <w:proofErr w:type="spellEnd"/>
-            <w:r>
-              <w:rPr>
-                <w:sz w:val="20"/>
-                <w:szCs w:val="20"/>
-              </w:rPr>
-              <w:t xml:space="preserve"> </w:t>
-            </w:r>
-            <w:proofErr w:type="spellStart"/>
-            <w:r>
-              <w:rPr>
-                <w:sz w:val="20"/>
-                <w:szCs w:val="20"/>
-              </w:rPr>
-              <w:t>asimétrica</w:t>
-            </w:r>
-            <w:proofErr w:type="spellEnd"/>
           </w:p>
         </w:tc>
       </w:tr>
       <w:tr>
-        <w:tblPrEx>
-          <w:tblCellMar>
-            <w:top w:w="0" w:type="dxa"/>
-            <w:bottom w:w="0" w:type="dxa"/>
-          </w:tblCellMar>
-        </w:tblPrEx>
         <w:tc>
           <w:tcPr>
             <w:tcW w:w="2600" w:type="dxa"/>
@@ -3995,21 +3563,12 @@
             </w:tcMar>
           </w:tcPr>
           <w:p>
-            <w:proofErr w:type="spellStart"/>
             <w:r>
               <w:rPr>
                 <w:sz w:val="20"/>
                 <w:szCs w:val="20"/>
               </w:rPr>
-              <w:t>Oceanía</w:t>
-            </w:r>
-            <w:proofErr w:type="spellEnd"/>
-            <w:r>
-              <w:rPr>
-                <w:sz w:val="20"/>
-                <w:szCs w:val="20"/>
-              </w:rPr>
-              <w:t xml:space="preserve"> (OFC)</w:t>
+              <w:t>Oceanía (OFC)</w:t>
             </w:r>
           </w:p>
         </w:tc>
@@ -4121,47 +3680,13 @@
             </w:tcMar>
           </w:tcPr>
           <w:p>
-            <w:proofErr w:type="spellStart"/>
             <w:r>
               <w:rPr>
                 <w:sz w:val="20"/>
                 <w:szCs w:val="20"/>
               </w:rPr>
-              <w:t>Muestra</w:t>
+              <w:t>Muestra muy pequeña</w:t>
             </w:r>
-            <w:proofErr w:type="spellEnd"/>
-            <w:r>
-              <w:rPr>
-                <w:sz w:val="20"/>
-                <w:szCs w:val="20"/>
-              </w:rPr>
-              <w:t xml:space="preserve"> </w:t>
-            </w:r>
-            <w:proofErr w:type="spellStart"/>
-            <w:r>
-              <w:rPr>
-                <w:sz w:val="20"/>
-                <w:szCs w:val="20"/>
-              </w:rPr>
-              <w:t>muy</w:t>
-            </w:r>
-            <w:proofErr w:type="spellEnd"/>
-            <w:r>
-              <w:rPr>
-                <w:sz w:val="20"/>
-                <w:szCs w:val="20"/>
-              </w:rPr>
-              <w:t xml:space="preserve"> </w:t>
-            </w:r>
-            <w:proofErr w:type="spellStart"/>
-            <w:r>
-              <w:rPr>
-                <w:sz w:val="20"/>
-                <w:szCs w:val="20"/>
-              </w:rPr>
-              <w:t>pequeña</w:t>
-            </w:r>
-            <w:proofErr w:type="spellEnd"/>
           </w:p>
         </w:tc>
       </w:tr>
@@ -4209,7 +3734,7 @@
           <w:lang w:val="es-AR"/>
         </w:rPr>
         <w:drawing>
-          <wp:inline distT="0" distB="0" distL="0" distR="0" wp14:anchorId="09F87E8D" wp14:editId="08AC5FB6">
+          <wp:inline distT="0" distB="0" distL="0" distR="0" wp14:anchorId="09F87E8D" wp14:editId="67CA39C2">
             <wp:extent cx="5731510" cy="1910715"/>
             <wp:effectExtent l="0" t="0" r="2540" b="0"/>
             <wp:docPr id="581471166" name="Picture 3"/>
@@ -4224,7 +3749,7 @@
                     <pic:cNvPicPr/>
                   </pic:nvPicPr>
                   <pic:blipFill>
-                    <a:blip r:embed="rId9" cstate="print">
+                    <a:blip r:embed="rId14" cstate="print">
                       <a:extLst>
                         <a:ext uri="{28A0092B-C50C-407E-A947-70E740481C1C}">
                           <a14:useLocalDpi xmlns:a14="http://schemas.microsoft.com/office/drawing/2010/main" val="0"/>
@@ -4358,33 +3883,13 @@
         <w:lastRenderedPageBreak/>
         <w:t xml:space="preserve">El análisis por idioma —aplicado mediante </w:t>
       </w:r>
-      <w:proofErr w:type="spellStart"/>
-      <w:proofErr w:type="gramStart"/>
       <w:r>
         <w:rPr>
           <w:i/>
           <w:iCs/>
           <w:lang w:val="es-AR"/>
         </w:rPr>
-        <w:t>groupby</w:t>
-      </w:r>
-      <w:proofErr w:type="spellEnd"/>
-      <w:r>
-        <w:rPr>
-          <w:i/>
-          <w:iCs/>
-          <w:lang w:val="es-AR"/>
-        </w:rPr>
-        <w:t>(</w:t>
-      </w:r>
-      <w:proofErr w:type="gramEnd"/>
-      <w:r>
-        <w:rPr>
-          <w:i/>
-          <w:iCs/>
-          <w:lang w:val="es-AR"/>
-        </w:rPr>
-        <w:t>)</w:t>
+        <w:t>groupby()</w:t>
       </w:r>
       <w:r>
         <w:rPr>
@@ -4417,34 +3922,8 @@
           <w:szCs w:val="20"/>
           <w:lang w:val="es-AR"/>
         </w:rPr>
-        <w:t xml:space="preserve">[ INSERTAR IMAGEN: </w:t>
-      </w:r>
-      <w:proofErr w:type="spellStart"/>
-      <w:proofErr w:type="gramStart"/>
-      <w:r>
-        <w:rPr>
-          <w:i/>
-          <w:iCs/>
-          <w:color w:val="888888"/>
-          <w:sz w:val="20"/>
-          <w:szCs w:val="20"/>
-          <w:lang w:val="es-AR"/>
-        </w:rPr>
-        <w:t>imagenes</w:t>
-      </w:r>
-      <w:proofErr w:type="spellEnd"/>
-      <w:r>
-        <w:rPr>
-          <w:i/>
-          <w:iCs/>
-          <w:color w:val="888888"/>
-          <w:sz w:val="20"/>
-          <w:szCs w:val="20"/>
-          <w:lang w:val="es-AR"/>
-        </w:rPr>
-        <w:t>/heatmap_correlacion.png ]</w:t>
-      </w:r>
-      <w:proofErr w:type="gramEnd"/>
+        <w:t>[ INSERTAR IMAGEN: imagenes/heatmap_correlacion.png ]</w:t>
+      </w:r>
     </w:p>
     <w:p>
       <w:pPr>
@@ -4468,31 +3947,7 @@
           <w:szCs w:val="20"/>
           <w:lang w:val="es-AR"/>
         </w:rPr>
-        <w:t xml:space="preserve">Figura 4. Mapa de calor de correlaciones entre variables numéricas del </w:t>
-      </w:r>
-      <w:proofErr w:type="spellStart"/>
-      <w:r>
-        <w:rPr>
-          <w:i/>
-          <w:iCs/>
-          <w:color w:val="444444"/>
-          <w:sz w:val="20"/>
-          <w:szCs w:val="20"/>
-          <w:lang w:val="es-AR"/>
-        </w:rPr>
-        <w:t>dataset</w:t>
-      </w:r>
-      <w:proofErr w:type="spellEnd"/>
-      <w:r>
-        <w:rPr>
-          <w:i/>
-          <w:iCs/>
-          <w:color w:val="444444"/>
-          <w:sz w:val="20"/>
-          <w:szCs w:val="20"/>
-          <w:lang w:val="es-AR"/>
-        </w:rPr>
-        <w:t xml:space="preserve"> integrado.</w:t>
+        <w:t>Figura 4. Mapa de calor de correlaciones entre variables numéricas del dataset integrado.</w:t>
       </w:r>
     </w:p>
     <w:p>
@@ -4701,13 +4156,8 @@
         <w:pStyle w:val="Heading2"/>
       </w:pPr>
       <w:r>
-        <w:t xml:space="preserve">5.1. </w:t>
-      </w:r>
-      <w:proofErr w:type="spellStart"/>
-      <w:r>
-        <w:t>Limitaciones</w:t>
-      </w:r>
-      <w:proofErr w:type="spellEnd"/>
+        <w:t>5.1. Limitaciones</w:t>
+      </w:r>
     </w:p>
     <w:p>
       <w:pPr>
@@ -4724,35 +4174,7 @@
         <w:rPr>
           <w:lang w:val="es-AR"/>
         </w:rPr>
-        <w:t xml:space="preserve">El </w:t>
-      </w:r>
-      <w:proofErr w:type="spellStart"/>
-      <w:r>
-        <w:rPr>
-          <w:lang w:val="es-AR"/>
-        </w:rPr>
-        <w:t>dataset</w:t>
-      </w:r>
-      <w:proofErr w:type="spellEnd"/>
-      <w:r>
-        <w:rPr>
-          <w:lang w:val="es-AR"/>
-        </w:rPr>
-        <w:t xml:space="preserve"> cubre un único torneo (2026) y un único período de medición </w:t>
-      </w:r>
-      <w:proofErr w:type="spellStart"/>
-      <w:r>
-        <w:rPr>
-          <w:lang w:val="es-AR"/>
-        </w:rPr>
-        <w:t>pre-torneo</w:t>
-      </w:r>
-      <w:proofErr w:type="spellEnd"/>
-      <w:r>
-        <w:rPr>
-          <w:lang w:val="es-AR"/>
-        </w:rPr>
-        <w:t>, por lo que las conclusiones no deben generalizarse a torneos anteriores sin análisis adicional.</w:t>
+        <w:t>El dataset cubre un único torneo (2026) y un único período de medición pre-torneo, por lo que las conclusiones no deben generalizarse a torneos anteriores sin análisis adicional.</w:t>
       </w:r>
     </w:p>
     <w:p>
@@ -4789,21 +4211,7 @@
           <w:lang w:val="es-AR"/>
         </w:rPr>
         <w:lastRenderedPageBreak/>
-        <w:t xml:space="preserve">La imputación del PBI de </w:t>
-      </w:r>
-      <w:proofErr w:type="spellStart"/>
-      <w:r>
-        <w:rPr>
-          <w:lang w:val="es-AR"/>
-        </w:rPr>
-        <w:t>Curaçao</w:t>
-      </w:r>
-      <w:proofErr w:type="spellEnd"/>
-      <w:r>
-        <w:rPr>
-          <w:lang w:val="es-AR"/>
-        </w:rPr>
-        <w:t xml:space="preserve"> introduce un supuesto que afecta marginalmente los resultados del análisis económico para ese país.</w:t>
+        <w:t>La imputación del PBI de Curaçao introduce un supuesto que afecta marginalmente los resultados del análisis económico para ese país.</w:t>
       </w:r>
     </w:p>
     <w:p>
@@ -4829,21 +4237,8 @@
         <w:pStyle w:val="Heading2"/>
       </w:pPr>
       <w:r>
-        <w:t xml:space="preserve">5.2. </w:t>
-      </w:r>
-      <w:proofErr w:type="spellStart"/>
-      <w:r>
-        <w:t>Posibles</w:t>
-      </w:r>
-      <w:proofErr w:type="spellEnd"/>
-      <w:r>
-        <w:t xml:space="preserve"> </w:t>
-      </w:r>
-      <w:proofErr w:type="spellStart"/>
-      <w:r>
-        <w:t>extensiones</w:t>
-      </w:r>
-      <w:proofErr w:type="spellEnd"/>
+        <w:t>5.2. Posibles extensiones</w:t>
+      </w:r>
     </w:p>
     <w:p>
       <w:pPr>
@@ -4936,49 +4331,7 @@
         <w:rPr>
           <w:lang w:val="es-AR"/>
         </w:rPr>
-        <w:t>La inteligencia artificial fue utilizada de manera sistemática en distintas etapas del trabajo. En la fase de análisis, se empleó Claude (</w:t>
-      </w:r>
-      <w:proofErr w:type="spellStart"/>
-      <w:r>
-        <w:rPr>
-          <w:lang w:val="es-AR"/>
-        </w:rPr>
-        <w:t>Anthropic</w:t>
-      </w:r>
-      <w:proofErr w:type="spellEnd"/>
-      <w:r>
-        <w:rPr>
-          <w:lang w:val="es-AR"/>
-        </w:rPr>
-        <w:t xml:space="preserve">) como asistente para la evaluación de modelos de ajuste de curvas: ante la pregunta de qué función describe mejor la relación entre valor de plantel y puntaje FIFA, el modelo sugirió comparar cuatro alternativas funcionales con criterio R², lo que condujo al hallazgo del modelo cuadrático como mejor ajuste. También se utilizó IA para depurar código de ajuste de curvas con </w:t>
-      </w:r>
-      <w:proofErr w:type="spellStart"/>
-      <w:r>
-        <w:rPr>
-          <w:lang w:val="es-AR"/>
-        </w:rPr>
-        <w:t>scipy</w:t>
-      </w:r>
-      <w:proofErr w:type="spellEnd"/>
-      <w:r>
-        <w:rPr>
-          <w:lang w:val="es-AR"/>
-        </w:rPr>
-        <w:t xml:space="preserve"> y para formular las derivadas analíticas con </w:t>
-      </w:r>
-      <w:proofErr w:type="spellStart"/>
-      <w:r>
-        <w:rPr>
-          <w:lang w:val="es-AR"/>
-        </w:rPr>
-        <w:t>sympy</w:t>
-      </w:r>
-      <w:proofErr w:type="spellEnd"/>
-      <w:r>
-        <w:rPr>
-          <w:lang w:val="es-AR"/>
-        </w:rPr>
-        <w:t>.</w:t>
+        <w:t>La inteligencia artificial fue utilizada de manera sistemática en distintas etapas del trabajo. En la fase de análisis, se empleó Claude (Anthropic) como asistente para la evaluación de modelos de ajuste de curvas: ante la pregunta de qué función describe mejor la relación entre valor de plantel y puntaje FIFA, el modelo sugirió comparar cuatro alternativas funcionales con criterio R², lo que condujo al hallazgo del modelo cuadrático como mejor ajuste. También se utilizó IA para depurar código de ajuste de curvas con scipy y para formular las derivadas analíticas con sympy.</w:t>
       </w:r>
     </w:p>
     <w:p>
@@ -5010,68 +4363,36 @@
           <w:bCs/>
           <w:lang w:val="es-AR"/>
         </w:rPr>
-        <w:t xml:space="preserve">Revisión </w:t>
-      </w:r>
-      <w:proofErr w:type="spellStart"/>
+        <w:t xml:space="preserve">Revisión intragrupal: </w:t>
+      </w:r>
+      <w:r>
+        <w:rPr>
+          <w:lang w:val="es-AR"/>
+        </w:rPr>
+        <w:t>los tres integrantes leyeron el informe de manera independiente y confrontaron cada afirmación cuantitativa con las salidas del notebook. Se detectaron y corrigieron imprecisiones en la interpretación inicial del coeficiente cuadrático del modelo de ajuste de curvas.</w:t>
+      </w:r>
+    </w:p>
+    <w:p>
+      <w:pPr>
+        <w:spacing w:after="140"/>
+        <w:jc w:val="both"/>
+        <w:rPr>
+          <w:lang w:val="es-AR"/>
+        </w:rPr>
+      </w:pPr>
       <w:r>
         <w:rPr>
           <w:b/>
           <w:bCs/>
           <w:lang w:val="es-AR"/>
         </w:rPr>
-        <w:t>intragrupal</w:t>
-      </w:r>
-      <w:proofErr w:type="spellEnd"/>
-      <w:r>
-        <w:rPr>
-          <w:b/>
-          <w:bCs/>
-          <w:lang w:val="es-AR"/>
-        </w:rPr>
-        <w:t xml:space="preserve">: </w:t>
-      </w:r>
-      <w:r>
-        <w:rPr>
-          <w:lang w:val="es-AR"/>
-        </w:rPr>
-        <w:t>los tres integrantes leyeron el informe de manera independiente y confrontaron cada afirmación cuantitativa con las salidas del notebook. Se detectaron y corrigieron imprecisiones en la interpretación inicial del coeficiente cuadrático del modelo de ajuste de curvas.</w:t>
-      </w:r>
-    </w:p>
-    <w:p>
-      <w:pPr>
-        <w:spacing w:after="140"/>
-        <w:jc w:val="both"/>
-        <w:rPr>
-          <w:lang w:val="es-AR"/>
-        </w:rPr>
-      </w:pPr>
-      <w:r>
-        <w:rPr>
-          <w:b/>
-          <w:bCs/>
-          <w:lang w:val="es-AR"/>
-        </w:rPr>
         <w:t xml:space="preserve">Aprendizajes: </w:t>
       </w:r>
       <w:r>
         <w:rPr>
           <w:lang w:val="es-AR"/>
         </w:rPr>
-        <w:t xml:space="preserve">el trabajo puso en evidencia que la integración de múltiples fuentes de datos con claves de cruce distintas requiere un proceso riguroso de normalización de nombres y validación de </w:t>
-      </w:r>
-      <w:proofErr w:type="spellStart"/>
-      <w:r>
-        <w:rPr>
-          <w:lang w:val="es-AR"/>
-        </w:rPr>
-        <w:t>merges</w:t>
-      </w:r>
-      <w:proofErr w:type="spellEnd"/>
-      <w:r>
-        <w:rPr>
-          <w:lang w:val="es-AR"/>
-        </w:rPr>
-        <w:t>. También ilustró que la ausencia de correlación entre variables macroeconómicas y desempeño deportivo es en sí misma un resultado informativo y no una falla del análisis.</w:t>
+        <w:t>el trabajo puso en evidencia que la integración de múltiples fuentes de datos con claves de cruce distintas requiere un proceso riguroso de normalización de nombres y validación de merges. También ilustró que la ausencia de correlación entre variables macroeconómicas y desempeño deportivo es en sí misma un resultado informativo y no una falla del análisis.</w:t>
       </w:r>
     </w:p>
     <w:p>
@@ -5090,13 +4411,8 @@
         <w:pStyle w:val="Heading1"/>
       </w:pPr>
       <w:r>
-        <w:t xml:space="preserve">§7. </w:t>
-      </w:r>
-      <w:proofErr w:type="spellStart"/>
-      <w:r>
-        <w:t>Referencias</w:t>
-      </w:r>
-      <w:proofErr w:type="spellEnd"/>
+        <w:t>§7. Referencias</w:t>
+      </w:r>
     </w:p>
     <w:p>
       <w:pPr>
@@ -5108,23 +4424,7 @@
           <w:i/>
           <w:iCs/>
         </w:rPr>
-        <w:t xml:space="preserve">Datasets </w:t>
-      </w:r>
-      <w:proofErr w:type="spellStart"/>
-      <w:r>
-        <w:rPr>
-          <w:i/>
-          <w:iCs/>
-        </w:rPr>
-        <w:t>utilizados</w:t>
-      </w:r>
-      <w:proofErr w:type="spellEnd"/>
-      <w:r>
-        <w:rPr>
-          <w:i/>
-          <w:iCs/>
-        </w:rPr>
-        <w:t>:</w:t>
+        <w:t>Datasets utilizados:</w:t>
       </w:r>
     </w:p>
     <w:p>
@@ -5135,21 +4435,8 @@
           <w:numId w:val="2"/>
         </w:numPr>
       </w:pPr>
-      <w:proofErr w:type="spellStart"/>
-      <w:r>
-        <w:t>SimpleMaps</w:t>
-      </w:r>
-      <w:proofErr w:type="spellEnd"/>
-      <w:r>
-        <w:t xml:space="preserve">. (2024). World Countries Database. </w:t>
-      </w:r>
-      <w:proofErr w:type="spellStart"/>
-      <w:r>
-        <w:t>Recuperado</w:t>
-      </w:r>
-      <w:proofErr w:type="spellEnd"/>
-      <w:r>
-        <w:t xml:space="preserve"> de https://simplemaps.com/data/countries</w:t>
+      <w:r>
+        <w:t>SimpleMaps. (2024). World Countries Database. Recuperado de https://simplemaps.com/data/countries</w:t>
       </w:r>
     </w:p>
     <w:p>
@@ -5161,15 +4448,7 @@
         </w:numPr>
       </w:pPr>
       <w:r>
-        <w:t xml:space="preserve">FIFA. (2025). FIFA Member Associations. </w:t>
-      </w:r>
-      <w:proofErr w:type="spellStart"/>
-      <w:r>
-        <w:t>Recuperado</w:t>
-      </w:r>
-      <w:proofErr w:type="spellEnd"/>
-      <w:r>
-        <w:t xml:space="preserve"> de https://www.fifa.com</w:t>
+        <w:t>FIFA. (2025). FIFA Member Associations. Recuperado de https://www.fifa.com</w:t>
       </w:r>
     </w:p>
     <w:p>
@@ -5183,33 +4462,11 @@
           <w:lang w:val="es-AR"/>
         </w:rPr>
       </w:pPr>
-      <w:proofErr w:type="spellStart"/>
-      <w:r>
-        <w:rPr>
-          <w:lang w:val="es-AR"/>
-        </w:rPr>
-        <w:t>Dataset</w:t>
-      </w:r>
-      <w:proofErr w:type="spellEnd"/>
-      <w:r>
-        <w:rPr>
-          <w:lang w:val="es-AR"/>
-        </w:rPr>
-        <w:t xml:space="preserve"> de selecciones Copa Mundial 2026 (paises.csv). Fuente: elaboración propia sobre datos públicos de </w:t>
-      </w:r>
-      <w:proofErr w:type="spellStart"/>
-      <w:r>
-        <w:rPr>
-          <w:lang w:val="es-AR"/>
-        </w:rPr>
-        <w:t>Kaggle</w:t>
-      </w:r>
-      <w:proofErr w:type="spellEnd"/>
-      <w:r>
-        <w:rPr>
-          <w:lang w:val="es-AR"/>
-        </w:rPr>
-        <w:t xml:space="preserve"> y FIFA Stats.</w:t>
+      <w:r>
+        <w:rPr>
+          <w:lang w:val="es-AR"/>
+        </w:rPr>
+        <w:t>Dataset de selecciones Copa Mundial 2026 (paises.csv). Fuente: elaboración propia sobre datos públicos de Kaggle y FIFA Stats.</w:t>
       </w:r>
     </w:p>
     <w:p>
@@ -5247,21 +4504,12 @@
         <w:spacing w:after="140"/>
         <w:jc w:val="both"/>
       </w:pPr>
-      <w:proofErr w:type="spellStart"/>
       <w:r>
         <w:rPr>
           <w:i/>
           <w:iCs/>
         </w:rPr>
-        <w:t>Herramientas</w:t>
-      </w:r>
-      <w:proofErr w:type="spellEnd"/>
-      <w:r>
-        <w:rPr>
-          <w:i/>
-          <w:iCs/>
-        </w:rPr>
-        <w:t>:</w:t>
+        <w:t>Herramientas:</w:t>
       </w:r>
     </w:p>
     <w:p>
@@ -5309,28 +4557,12 @@
         </w:numPr>
       </w:pPr>
       <w:r>
-        <w:t xml:space="preserve">Meurer, A. et al. (2017). </w:t>
-      </w:r>
-      <w:proofErr w:type="spellStart"/>
-      <w:r>
-        <w:t>SymPy</w:t>
-      </w:r>
-      <w:proofErr w:type="spellEnd"/>
-      <w:r>
-        <w:t xml:space="preserve">: symbolic computing in Python. </w:t>
-      </w:r>
-      <w:proofErr w:type="spellStart"/>
-      <w:r>
-        <w:t>PeerJ</w:t>
-      </w:r>
-      <w:proofErr w:type="spellEnd"/>
-      <w:r>
-        <w:t xml:space="preserve"> Computer Science, 3, e103.</w:t>
+        <w:t>Meurer, A. et al. (2017). SymPy: symbolic computing in Python. PeerJ Computer Science, 3, e103.</w:t>
       </w:r>
     </w:p>
     <w:sectPr>
-      <w:headerReference w:type="default" r:id="rId10"/>
-      <w:footerReference w:type="default" r:id="rId11"/>
+      <w:headerReference w:type="default" r:id="rId15"/>
+      <w:footerReference w:type="default" r:id="rId16"/>
       <w:pgSz w:w="11906" w:h="16838"/>
       <w:pgMar w:top="1440" w:right="1440" w:bottom="1440" w:left="1440" w:header="708" w:footer="708" w:gutter="0"/>
       <w:cols w:space="720"/>
@@ -5338,6 +4570,136 @@
     </w:sectPr>
   </w:body>
 </w:document>
+</file>
+
+<file path=word/comments.xml><?xml version="1.0" encoding="utf-8"?>
+<w:comments xmlns:wpc="http://schemas.microsoft.com/office/word/2010/wordprocessingCanvas" xmlns:cx="http://schemas.microsoft.com/office/drawing/2014/chartex" xmlns:cx1="http://schemas.microsoft.com/office/drawing/2015/9/8/chartex" xmlns:cx2="http://schemas.microsoft.com/office/drawing/2015/10/21/chartex" xmlns:cx3="http://schemas.microsoft.com/office/drawing/2016/5/9/chartex" xmlns:cx4="http://schemas.microsoft.com/office/drawing/2016/5/10/chartex" xmlns:cx5="http://schemas.microsoft.com/office/drawing/2016/5/11/chartex" xmlns:cx6="http://schemas.microsoft.com/office/drawing/2016/5/12/chartex" xmlns:cx7="http://schemas.microsoft.com/office/drawing/2016/5/13/chartex" xmlns:cx8="http://schemas.microsoft.com/office/drawing/2016/5/14/chartex" xmlns:mc="http://schemas.openxmlformats.org/markup-compatibility/2006" xmlns:aink="http://schemas.microsoft.com/office/drawing/2016/ink" xmlns:am3d="http://schemas.microsoft.com/office/drawing/2017/model3d" xmlns:o="urn:schemas-microsoft-com:office:office" xmlns:oel="http://schemas.microsoft.com/office/2019/extlst" xmlns:r="http://schemas.openxmlformats.org/officeDocument/2006/relationships" xmlns:m="http://schemas.openxmlformats.org/officeDocument/2006/math" xmlns:v="urn:schemas-microsoft-com:vml" xmlns:wp14="http://schemas.microsoft.com/office/word/2010/wordprocessingDrawing" xmlns:wp="http://schemas.openxmlformats.org/drawingml/2006/wordprocessingDrawing" xmlns:w10="urn:schemas-microsoft-com:office:word" xmlns:w="http://schemas.openxmlformats.org/wordprocessingml/2006/main" xmlns:w14="http://schemas.microsoft.com/office/word/2010/wordml" xmlns:w15="http://schemas.microsoft.com/office/word/2012/wordml" xmlns:w16cex="http://schemas.microsoft.com/office/word/2018/wordml/cex" xmlns:w16cid="http://schemas.microsoft.com/office/word/2016/wordml/cid" xmlns:w16="http://schemas.microsoft.com/office/word/2018/wordml" xmlns:w16du="http://schemas.microsoft.com/office/word/2023/wordml/word16du" xmlns:w16sdtdh="http://schemas.microsoft.com/office/word/2020/wordml/sdtdatahash" xmlns:w16sdtfl="http://schemas.microsoft.com/office/word/2024/wordml/sdtformatlock" xmlns:w16se="http://schemas.microsoft.com/office/word/2015/wordml/symex" xmlns:wpg="http://schemas.microsoft.com/office/word/2010/wordprocessingGroup" xmlns:wpi="http://schemas.microsoft.com/office/word/2010/wordprocessingInk" xmlns:wne="http://schemas.microsoft.com/office/word/2006/wordml" xmlns:wps="http://schemas.microsoft.com/office/word/2010/wordprocessingShape" mc:Ignorable="w14 w15 w16se w16cid w16 w16cex w16sdtdh w16sdtfl w16du wp14">
+  <w:comment w:id="0" w:author="Carla Garibotti" w:date="2026-05-31T12:07:00Z" w:initials="CG">
+    <w:p>
+      <w:pPr>
+        <w:pStyle w:val="CommentText"/>
+      </w:pPr>
+      <w:r>
+        <w:rPr>
+          <w:rStyle w:val="CommentReference"/>
+        </w:rPr>
+        <w:annotationRef/>
+      </w:r>
+      <w:r>
+        <w:rPr>
+          <w:lang w:val="it-IT"/>
+        </w:rPr>
+        <w:t>Si vamos a usar citas, hay que poner a quien estamos citando. Quien dice esto?</w:t>
+      </w:r>
+    </w:p>
+  </w:comment>
+  <w:comment w:id="1" w:author="Carla Garibotti" w:date="2026-05-31T12:07:00Z" w:initials="CG">
+    <w:p>
+      <w:pPr>
+        <w:pStyle w:val="CommentText"/>
+      </w:pPr>
+      <w:r>
+        <w:rPr>
+          <w:rStyle w:val="CommentReference"/>
+        </w:rPr>
+        <w:annotationRef/>
+      </w:r>
+      <w:r>
+        <w:rPr>
+          <w:lang w:val="it-IT"/>
+        </w:rPr>
+        <w:t>Que datos propios?</w:t>
+      </w:r>
+    </w:p>
+  </w:comment>
+  <w:comment w:id="2" w:author="Carla Garibotti" w:date="2026-05-31T12:10:00Z" w:initials="CG">
+    <w:p>
+      <w:pPr>
+        <w:pStyle w:val="CommentText"/>
+      </w:pPr>
+      <w:r>
+        <w:rPr>
+          <w:rStyle w:val="CommentReference"/>
+        </w:rPr>
+        <w:annotationRef/>
+      </w:r>
+      <w:r>
+        <w:rPr>
+          <w:lang w:val="it-IT"/>
+        </w:rPr>
+        <w:t>Revisar cual es la variable dependiente y cual es la independiente.</w:t>
+      </w:r>
+    </w:p>
+    <w:p>
+      <w:pPr>
+        <w:pStyle w:val="CommentText"/>
+      </w:pPr>
+      <w:r>
+        <w:rPr>
+          <w:lang w:val="it-IT"/>
+        </w:rPr>
+        <w:t>X = Explicativa = independiente</w:t>
+      </w:r>
+    </w:p>
+    <w:p>
+      <w:pPr>
+        <w:pStyle w:val="CommentText"/>
+      </w:pPr>
+      <w:r>
+        <w:rPr>
+          <w:lang w:val="it-IT"/>
+        </w:rPr>
+        <w:t>Y = De respuesta = dependiente</w:t>
+      </w:r>
+    </w:p>
+  </w:comment>
+  <w:comment w:id="3" w:author="Carla Garibotti" w:date="2026-05-31T12:06:00Z" w:initials="CG">
+    <w:p>
+      <w:pPr>
+        <w:pStyle w:val="CommentText"/>
+      </w:pPr>
+      <w:r>
+        <w:rPr>
+          <w:rStyle w:val="CommentReference"/>
+        </w:rPr>
+        <w:annotationRef/>
+      </w:r>
+      <w:r>
+        <w:rPr>
+          <w:lang w:val="it-IT"/>
+        </w:rPr>
+        <w:t>Por que decimos esto?</w:t>
+      </w:r>
+    </w:p>
+  </w:comment>
+</w:comments>
+</file>
+
+<file path=word/commentsExtended.xml><?xml version="1.0" encoding="utf-8"?>
+<w15:commentsEx xmlns:wpc="http://schemas.microsoft.com/office/word/2010/wordprocessingCanvas" xmlns:cx="http://schemas.microsoft.com/office/drawing/2014/chartex" xmlns:cx1="http://schemas.microsoft.com/office/drawing/2015/9/8/chartex" xmlns:cx2="http://schemas.microsoft.com/office/drawing/2015/10/21/chartex" xmlns:cx3="http://schemas.microsoft.com/office/drawing/2016/5/9/chartex" xmlns:cx4="http://schemas.microsoft.com/office/drawing/2016/5/10/chartex" xmlns:cx5="http://schemas.microsoft.com/office/drawing/2016/5/11/chartex" xmlns:cx6="http://schemas.microsoft.com/office/drawing/2016/5/12/chartex" xmlns:cx7="http://schemas.microsoft.com/office/drawing/2016/5/13/chartex" xmlns:cx8="http://schemas.microsoft.com/office/drawing/2016/5/14/chartex" xmlns:mc="http://schemas.openxmlformats.org/markup-compatibility/2006" xmlns:aink="http://schemas.microsoft.com/office/drawing/2016/ink" xmlns:am3d="http://schemas.microsoft.com/office/drawing/2017/model3d" xmlns:o="urn:schemas-microsoft-com:office:office" xmlns:oel="http://schemas.microsoft.com/office/2019/extlst" xmlns:r="http://schemas.openxmlformats.org/officeDocument/2006/relationships" xmlns:m="http://schemas.openxmlformats.org/officeDocument/2006/math" xmlns:v="urn:schemas-microsoft-com:vml" xmlns:wp14="http://schemas.microsoft.com/office/word/2010/wordprocessingDrawing" xmlns:wp="http://schemas.openxmlformats.org/drawingml/2006/wordprocessingDrawing" xmlns:w10="urn:schemas-microsoft-com:office:word" xmlns:w="http://schemas.openxmlformats.org/wordprocessingml/2006/main" xmlns:w14="http://schemas.microsoft.com/office/word/2010/wordml" xmlns:w15="http://schemas.microsoft.com/office/word/2012/wordml" xmlns:w16cex="http://schemas.microsoft.com/office/word/2018/wordml/cex" xmlns:w16cid="http://schemas.microsoft.com/office/word/2016/wordml/cid" xmlns:w16="http://schemas.microsoft.com/office/word/2018/wordml" xmlns:w16du="http://schemas.microsoft.com/office/word/2023/wordml/word16du" xmlns:w16sdtdh="http://schemas.microsoft.com/office/word/2020/wordml/sdtdatahash" xmlns:w16sdtfl="http://schemas.microsoft.com/office/word/2024/wordml/sdtformatlock" xmlns:w16se="http://schemas.microsoft.com/office/word/2015/wordml/symex" xmlns:wpg="http://schemas.microsoft.com/office/word/2010/wordprocessingGroup" xmlns:wpi="http://schemas.microsoft.com/office/word/2010/wordprocessingInk" xmlns:wne="http://schemas.microsoft.com/office/word/2006/wordml" xmlns:wps="http://schemas.microsoft.com/office/word/2010/wordprocessingShape" mc:Ignorable="w14 w15 w16se w16cid w16 w16cex w16sdtdh w16sdtfl w16du wp14">
+  <w15:commentEx w15:paraId="4779899A" w15:done="0"/>
+  <w15:commentEx w15:paraId="23E72C18" w15:done="0"/>
+  <w15:commentEx w15:paraId="44834927" w15:done="0"/>
+  <w15:commentEx w15:paraId="28B803D1" w15:done="0"/>
+</w15:commentsEx>
+</file>
+
+<file path=word/commentsExtensible.xml><?xml version="1.0" encoding="utf-8"?>
+<w16cex:commentsExtensible xmlns:wpc="http://schemas.microsoft.com/office/word/2010/wordprocessingCanvas" xmlns:cx="http://schemas.microsoft.com/office/drawing/2014/chartex" xmlns:cx1="http://schemas.microsoft.com/office/drawing/2015/9/8/chartex" xmlns:cx2="http://schemas.microsoft.com/office/drawing/2015/10/21/chartex" xmlns:cx3="http://schemas.microsoft.com/office/drawing/2016/5/9/chartex" xmlns:cx4="http://schemas.microsoft.com/office/drawing/2016/5/10/chartex" xmlns:cx5="http://schemas.microsoft.com/office/drawing/2016/5/11/chartex" xmlns:cx6="http://schemas.microsoft.com/office/drawing/2016/5/12/chartex" xmlns:cx7="http://schemas.microsoft.com/office/drawing/2016/5/13/chartex" xmlns:cx8="http://schemas.microsoft.com/office/drawing/2016/5/14/chartex" xmlns:cr="http://schemas.microsoft.com/office/comments/2020/reactions" xmlns:mc="http://schemas.openxmlformats.org/markup-compatibility/2006" xmlns:aink="http://schemas.microsoft.com/office/drawing/2016/ink" xmlns:am3d="http://schemas.microsoft.com/office/drawing/2017/model3d" xmlns:o="urn:schemas-microsoft-com:office:office" xmlns:oel="http://schemas.microsoft.com/office/2019/extlst" xmlns:r="http://schemas.openxmlformats.org/officeDocument/2006/relationships" xmlns:m="http://schemas.openxmlformats.org/officeDocument/2006/math" xmlns:v="urn:schemas-microsoft-com:vml" xmlns:wp14="http://schemas.microsoft.com/office/word/2010/wordprocessingDrawing" xmlns:wp="http://schemas.openxmlformats.org/drawingml/2006/wordprocessingDrawing" xmlns:w10="urn:schemas-microsoft-com:office:word" xmlns:w="http://schemas.openxmlformats.org/wordprocessingml/2006/main" xmlns:w14="http://schemas.microsoft.com/office/word/2010/wordml" xmlns:w15="http://schemas.microsoft.com/office/word/2012/wordml" xmlns:w16cex="http://schemas.microsoft.com/office/word/2018/wordml/cex" xmlns:w16cid="http://schemas.microsoft.com/office/word/2016/wordml/cid" xmlns:w16="http://schemas.microsoft.com/office/word/2018/wordml" xmlns:w16du="http://schemas.microsoft.com/office/word/2023/wordml/word16du" xmlns:w16sdtdh="http://schemas.microsoft.com/office/word/2020/wordml/sdtdatahash" xmlns:w16sdtfl="http://schemas.microsoft.com/office/word/2024/wordml/sdtformatlock" xmlns:w16se="http://schemas.microsoft.com/office/word/2015/wordml/symex" xmlns:wpg="http://schemas.microsoft.com/office/word/2010/wordprocessingGroup" xmlns:wpi="http://schemas.microsoft.com/office/word/2010/wordprocessingInk" xmlns:wne="http://schemas.microsoft.com/office/word/2006/wordml" xmlns:wps="http://schemas.microsoft.com/office/word/2010/wordprocessingShape" mc:Ignorable="w14 w15 w16se w16cid w16 w16cex w16sdtdh w16sdtfl cr w16du wp14">
+  <w16cex:commentExtensible w16cex:durableId="588B6CA9" w16cex:dateUtc="2026-05-31T15:07:00Z"/>
+  <w16cex:commentExtensible w16cex:durableId="22C07B07" w16cex:dateUtc="2026-05-31T15:07:00Z"/>
+  <w16cex:commentExtensible w16cex:durableId="43980DBF" w16cex:dateUtc="2026-05-31T15:10:00Z"/>
+  <w16cex:commentExtensible w16cex:durableId="47F0247D" w16cex:dateUtc="2026-05-31T15:06:00Z"/>
+</w16cex:commentsExtensible>
+</file>
+
+<file path=word/commentsIds.xml><?xml version="1.0" encoding="utf-8"?>
+<w16cid:commentsIds xmlns:wpc="http://schemas.microsoft.com/office/word/2010/wordprocessingCanvas" xmlns:cx="http://schemas.microsoft.com/office/drawing/2014/chartex" xmlns:cx1="http://schemas.microsoft.com/office/drawing/2015/9/8/chartex" xmlns:cx2="http://schemas.microsoft.com/office/drawing/2015/10/21/chartex" xmlns:cx3="http://schemas.microsoft.com/office/drawing/2016/5/9/chartex" xmlns:cx4="http://schemas.microsoft.com/office/drawing/2016/5/10/chartex" xmlns:cx5="http://schemas.microsoft.com/office/drawing/2016/5/11/chartex" xmlns:cx6="http://schemas.microsoft.com/office/drawing/2016/5/12/chartex" xmlns:cx7="http://schemas.microsoft.com/office/drawing/2016/5/13/chartex" xmlns:cx8="http://schemas.microsoft.com/office/drawing/2016/5/14/chartex" xmlns:mc="http://schemas.openxmlformats.org/markup-compatibility/2006" xmlns:aink="http://schemas.microsoft.com/office/drawing/2016/ink" xmlns:am3d="http://schemas.microsoft.com/office/drawing/2017/model3d" xmlns:o="urn:schemas-microsoft-com:office:office" xmlns:oel="http://schemas.microsoft.com/office/2019/extlst" xmlns:r="http://schemas.openxmlformats.org/officeDocument/2006/relationships" xmlns:m="http://schemas.openxmlformats.org/officeDocument/2006/math" xmlns:v="urn:schemas-microsoft-com:vml" xmlns:wp14="http://schemas.microsoft.com/office/word/2010/wordprocessingDrawing" xmlns:wp="http://schemas.openxmlformats.org/drawingml/2006/wordprocessingDrawing" xmlns:w10="urn:schemas-microsoft-com:office:word" xmlns:w="http://schemas.openxmlformats.org/wordprocessingml/2006/main" xmlns:w14="http://schemas.microsoft.com/office/word/2010/wordml" xmlns:w15="http://schemas.microsoft.com/office/word/2012/wordml" xmlns:w16cex="http://schemas.microsoft.com/office/word/2018/wordml/cex" xmlns:w16cid="http://schemas.microsoft.com/office/word/2016/wordml/cid" xmlns:w16="http://schemas.microsoft.com/office/word/2018/wordml" xmlns:w16du="http://schemas.microsoft.com/office/word/2023/wordml/word16du" xmlns:w16sdtdh="http://schemas.microsoft.com/office/word/2020/wordml/sdtdatahash" xmlns:w16sdtfl="http://schemas.microsoft.com/office/word/2024/wordml/sdtformatlock" xmlns:w16se="http://schemas.microsoft.com/office/word/2015/wordml/symex" xmlns:wpg="http://schemas.microsoft.com/office/word/2010/wordprocessingGroup" xmlns:wpi="http://schemas.microsoft.com/office/word/2010/wordprocessingInk" xmlns:wne="http://schemas.microsoft.com/office/word/2006/wordml" xmlns:wps="http://schemas.microsoft.com/office/word/2010/wordprocessingShape" mc:Ignorable="w14 w15 w16se w16cid w16 w16cex w16sdtdh w16sdtfl w16du wp14">
+  <w16cid:commentId w16cid:paraId="4779899A" w16cid:durableId="588B6CA9"/>
+  <w16cid:commentId w16cid:paraId="23E72C18" w16cid:durableId="22C07B07"/>
+  <w16cid:commentId w16cid:paraId="44834927" w16cid:durableId="43980DBF"/>
+  <w16cid:commentId w16cid:paraId="28B803D1" w16cid:durableId="47F0247D"/>
+</w16cid:commentsIds>
 </file>
 
 <file path=word/endnotes.xml><?xml version="1.0" encoding="utf-8"?>
@@ -5731,6 +5093,14 @@
     </w:lvlOverride>
   </w:num>
 </w:numbering>
+</file>
+
+<file path=word/people.xml><?xml version="1.0" encoding="utf-8"?>
+<w15:people xmlns:wpc="http://schemas.microsoft.com/office/word/2010/wordprocessingCanvas" xmlns:cx="http://schemas.microsoft.com/office/drawing/2014/chartex" xmlns:cx1="http://schemas.microsoft.com/office/drawing/2015/9/8/chartex" xmlns:cx2="http://schemas.microsoft.com/office/drawing/2015/10/21/chartex" xmlns:cx3="http://schemas.microsoft.com/office/drawing/2016/5/9/chartex" xmlns:cx4="http://schemas.microsoft.com/office/drawing/2016/5/10/chartex" xmlns:cx5="http://schemas.microsoft.com/office/drawing/2016/5/11/chartex" xmlns:cx6="http://schemas.microsoft.com/office/drawing/2016/5/12/chartex" xmlns:cx7="http://schemas.microsoft.com/office/drawing/2016/5/13/chartex" xmlns:cx8="http://schemas.microsoft.com/office/drawing/2016/5/14/chartex" xmlns:mc="http://schemas.openxmlformats.org/markup-compatibility/2006" xmlns:aink="http://schemas.microsoft.com/office/drawing/2016/ink" xmlns:am3d="http://schemas.microsoft.com/office/drawing/2017/model3d" xmlns:o="urn:schemas-microsoft-com:office:office" xmlns:oel="http://schemas.microsoft.com/office/2019/extlst" xmlns:r="http://schemas.openxmlformats.org/officeDocument/2006/relationships" xmlns:m="http://schemas.openxmlformats.org/officeDocument/2006/math" xmlns:v="urn:schemas-microsoft-com:vml" xmlns:wp14="http://schemas.microsoft.com/office/word/2010/wordprocessingDrawing" xmlns:wp="http://schemas.openxmlformats.org/drawingml/2006/wordprocessingDrawing" xmlns:w10="urn:schemas-microsoft-com:office:word" xmlns:w="http://schemas.openxmlformats.org/wordprocessingml/2006/main" xmlns:w14="http://schemas.microsoft.com/office/word/2010/wordml" xmlns:w15="http://schemas.microsoft.com/office/word/2012/wordml" xmlns:w16cex="http://schemas.microsoft.com/office/word/2018/wordml/cex" xmlns:w16cid="http://schemas.microsoft.com/office/word/2016/wordml/cid" xmlns:w16="http://schemas.microsoft.com/office/word/2018/wordml" xmlns:w16du="http://schemas.microsoft.com/office/word/2023/wordml/word16du" xmlns:w16sdtdh="http://schemas.microsoft.com/office/word/2020/wordml/sdtdatahash" xmlns:w16sdtfl="http://schemas.microsoft.com/office/word/2024/wordml/sdtformatlock" xmlns:w16se="http://schemas.microsoft.com/office/word/2015/wordml/symex" xmlns:wpg="http://schemas.microsoft.com/office/word/2010/wordprocessingGroup" xmlns:wpi="http://schemas.microsoft.com/office/word/2010/wordprocessingInk" xmlns:wne="http://schemas.microsoft.com/office/word/2006/wordml" xmlns:wps="http://schemas.microsoft.com/office/word/2010/wordprocessingShape" mc:Ignorable="w14 w15 w16se w16cid w16 w16cex w16sdtdh w16sdtfl w16du wp14">
+  <w15:person w15:author="Carla Garibotti">
+    <w15:presenceInfo w15:providerId="AD" w15:userId="S::cgaribotti@dreiconsa.com::e108638f-f23e-4831-a3ea-e344dafbfbb3"/>
+  </w15:person>
+</w15:people>
 </file>
 
 <file path=word/styles.xml><?xml version="1.0" encoding="utf-8"?>
@@ -6337,6 +5707,69 @@
       <w:szCs w:val="20"/>
     </w:rPr>
   </w:style>
+  <w:style w:type="character" w:styleId="CommentReference">
+    <w:name w:val="annotation reference"/>
+    <w:basedOn w:val="DefaultParagraphFont"/>
+    <w:uiPriority w:val="99"/>
+    <w:semiHidden/>
+    <w:unhideWhenUsed/>
+    <w:rsid w:val="00D229B7"/>
+    <w:rPr>
+      <w:sz w:val="16"/>
+      <w:szCs w:val="16"/>
+    </w:rPr>
+  </w:style>
+  <w:style w:type="paragraph" w:styleId="CommentText">
+    <w:name w:val="annotation text"/>
+    <w:basedOn w:val="Normal"/>
+    <w:link w:val="CommentTextChar"/>
+    <w:uiPriority w:val="99"/>
+    <w:unhideWhenUsed/>
+    <w:rsid w:val="00D229B7"/>
+    <w:rPr>
+      <w:sz w:val="20"/>
+      <w:szCs w:val="20"/>
+    </w:rPr>
+  </w:style>
+  <w:style w:type="character" w:customStyle="1" w:styleId="CommentTextChar">
+    <w:name w:val="Comment Text Char"/>
+    <w:basedOn w:val="DefaultParagraphFont"/>
+    <w:link w:val="CommentText"/>
+    <w:uiPriority w:val="99"/>
+    <w:rsid w:val="00D229B7"/>
+    <w:rPr>
+      <w:sz w:val="20"/>
+      <w:szCs w:val="20"/>
+    </w:rPr>
+  </w:style>
+  <w:style w:type="paragraph" w:styleId="CommentSubject">
+    <w:name w:val="annotation subject"/>
+    <w:basedOn w:val="CommentText"/>
+    <w:next w:val="CommentText"/>
+    <w:link w:val="CommentSubjectChar"/>
+    <w:uiPriority w:val="99"/>
+    <w:semiHidden/>
+    <w:unhideWhenUsed/>
+    <w:rsid w:val="00D229B7"/>
+    <w:rPr>
+      <w:b/>
+      <w:bCs/>
+    </w:rPr>
+  </w:style>
+  <w:style w:type="character" w:customStyle="1" w:styleId="CommentSubjectChar">
+    <w:name w:val="Comment Subject Char"/>
+    <w:basedOn w:val="CommentTextChar"/>
+    <w:link w:val="CommentSubject"/>
+    <w:uiPriority w:val="99"/>
+    <w:semiHidden/>
+    <w:rsid w:val="00D229B7"/>
+    <w:rPr>
+      <w:b/>
+      <w:bCs/>
+      <w:sz w:val="20"/>
+      <w:szCs w:val="20"/>
+    </w:rPr>
+  </w:style>
 </w:styles>
 </file>
 
@@ -6653,4 +6086,16 @@
     </a:ext>
   </a:extLst>
 </a:theme>
+</file>
+
+<file path=customXml/item1.xml><?xml version="1.0" encoding="utf-8"?>
+<b:Sources xmlns:b="http://schemas.openxmlformats.org/officeDocument/2006/bibliography" xmlns="http://schemas.openxmlformats.org/officeDocument/2006/bibliography" SelectedStyle="\APASixthEditionOfficeOnline.xsl" StyleName="APA" Version="6"/>
+</file>
+
+<file path=customXml/itemProps1.xml><?xml version="1.0" encoding="utf-8"?>
+<ds:datastoreItem xmlns:ds="http://schemas.openxmlformats.org/officeDocument/2006/customXml" ds:itemID="{4C81E4A2-5C23-448B-802F-9D73F75F9309}">
+  <ds:schemaRefs>
+    <ds:schemaRef ds:uri="http://schemas.openxmlformats.org/officeDocument/2006/bibliography"/>
+  </ds:schemaRefs>
+</ds:datastoreItem>
 </file>
</xml_diff>